<commit_message>
v1.5.4 - Audit P1+P2+P3: scan serveur recursif (documents officiels + sous-dossiers inconnus), compteurs stricts, nettoyage disque vers _copies_anciennes/audit-2026-09-18, AUDIT.md
</commit_message>
<xml_diff>
--- a/3ème Année/Récits de voyage/documents/répartition/Répartition_pédagogique_—_Récits_de_voyage.docx
+++ b/3ème Année/Récits de voyage/documents/répartition/Répartition_pédagogique_—_Récits_de_voyage.docx
@@ -164,7 +164,7 @@
                 <w:rFonts w:ascii="Comic Sans MS" w:hAnsi="Comic Sans MS"/>
                 <w:sz w:val="26"/>
               </w:rPr>
-              <w:t xml:space="preserve">- Séance 1 :</w:t>
+              <w:t xml:space="preserve">- Séance 1 : 1</w:t>
             </w:r>
             <w:r/>
           </w:p>
@@ -1412,7 +1412,6 @@
         <w:ind/>
         <w:rPr/>
       </w:pPr>
-      <w:r/>
       <w:r>
         <w:separator/>
       </w:r>
@@ -1427,7 +1426,6 @@
         <w:ind/>
         <w:rPr/>
       </w:pPr>
-      <w:r/>
       <w:r>
         <w:continuationSeparator/>
       </w:r>
@@ -1447,7 +1445,6 @@
         <w:ind/>
         <w:rPr/>
       </w:pPr>
-      <w:r/>
       <w:r>
         <w:separator/>
       </w:r>
@@ -1462,7 +1459,6 @@
         <w:ind/>
         <w:rPr/>
       </w:pPr>
-      <w:r/>
       <w:r>
         <w:continuationSeparator/>
       </w:r>
@@ -1617,7 +1613,7 @@
     <w:lsdException w:name="Bibliography" w:uiPriority="37"/>
     <w:lsdException w:name="TOC Heading" w:uiPriority="39" w:qFormat="1"/>
   </w:latentStyles>
-  <w:style w:type="table" w:styleId="11" w:default="1">
+  <w:style w:type="table" w:styleId="701" w:default="1">
     <w:name w:val="Normal Table"/>
     <w:uiPriority w:val="99"/>
     <w:semiHidden/>
@@ -1810,9 +1806,9 @@
       </w:tcPr>
     </w:tblStylePr>
   </w:style>
-  <w:style w:type="table" w:styleId="12">
+  <w:style w:type="table" w:styleId="702">
     <w:name w:val="Table Grid"/>
-    <w:basedOn w:val="11"/>
+    <w:basedOn w:val="701"/>
     <w:uiPriority w:val="59"/>
     <w:pPr>
       <w:pBdr/>
@@ -2009,9 +2005,9 @@
       </w:tcPr>
     </w:tblStylePr>
   </w:style>
-  <w:style w:type="table" w:styleId="13">
+  <w:style w:type="table" w:styleId="703">
     <w:name w:val="Table Grid Light"/>
-    <w:basedOn w:val="11"/>
+    <w:basedOn w:val="701"/>
     <w:uiPriority w:val="59"/>
     <w:pPr>
       <w:pBdr/>
@@ -2208,9 +2204,9 @@
       </w:tcPr>
     </w:tblStylePr>
   </w:style>
-  <w:style w:type="table" w:styleId="14">
+  <w:style w:type="table" w:styleId="704">
     <w:name w:val="Plain Table 1"/>
-    <w:basedOn w:val="11"/>
+    <w:basedOn w:val="701"/>
     <w:uiPriority w:val="59"/>
     <w:pPr>
       <w:pBdr/>
@@ -2433,9 +2429,9 @@
       </w:tcPr>
     </w:tblStylePr>
   </w:style>
-  <w:style w:type="table" w:styleId="15">
+  <w:style w:type="table" w:styleId="705">
     <w:name w:val="Plain Table 2"/>
-    <w:basedOn w:val="11"/>
+    <w:basedOn w:val="701"/>
     <w:uiPriority w:val="59"/>
     <w:pPr>
       <w:pBdr/>
@@ -2666,9 +2662,9 @@
       </w:tcPr>
     </w:tblStylePr>
   </w:style>
-  <w:style w:type="table" w:styleId="16">
+  <w:style w:type="table" w:styleId="706">
     <w:name w:val="Plain Table 3"/>
-    <w:basedOn w:val="11"/>
+    <w:basedOn w:val="701"/>
     <w:uiPriority w:val="99"/>
     <w:pPr>
       <w:pBdr/>
@@ -2896,9 +2892,9 @@
       </w:tcPr>
     </w:tblStylePr>
   </w:style>
-  <w:style w:type="table" w:styleId="17">
+  <w:style w:type="table" w:styleId="707">
     <w:name w:val="Plain Table 4"/>
-    <w:basedOn w:val="11"/>
+    <w:basedOn w:val="701"/>
     <w:uiPriority w:val="99"/>
     <w:pPr>
       <w:pBdr/>
@@ -3112,9 +3108,9 @@
       </w:tcPr>
     </w:tblStylePr>
   </w:style>
-  <w:style w:type="table" w:styleId="18">
+  <w:style w:type="table" w:styleId="708">
     <w:name w:val="Plain Table 5"/>
-    <w:basedOn w:val="11"/>
+    <w:basedOn w:val="701"/>
     <w:uiPriority w:val="99"/>
     <w:pPr>
       <w:pBdr/>
@@ -3345,9 +3341,9 @@
       </w:tcPr>
     </w:tblStylePr>
   </w:style>
-  <w:style w:type="table" w:styleId="19">
+  <w:style w:type="table" w:styleId="709">
     <w:name w:val="Grid Table 1 Light"/>
-    <w:basedOn w:val="11"/>
+    <w:basedOn w:val="701"/>
     <w:uiPriority w:val="99"/>
     <w:pPr>
       <w:pBdr/>
@@ -3568,9 +3564,9 @@
       </w:tcPr>
     </w:tblStylePr>
   </w:style>
-  <w:style w:type="table" w:styleId="20">
+  <w:style w:type="table" w:styleId="710">
     <w:name w:val="Grid Table 1 Light - Accent 1"/>
-    <w:basedOn w:val="11"/>
+    <w:basedOn w:val="701"/>
     <w:uiPriority w:val="99"/>
     <w:pPr>
       <w:pBdr/>
@@ -3791,9 +3787,9 @@
       </w:tcPr>
     </w:tblStylePr>
   </w:style>
-  <w:style w:type="table" w:styleId="21">
+  <w:style w:type="table" w:styleId="711">
     <w:name w:val="Grid Table 1 Light - Accent 2"/>
-    <w:basedOn w:val="11"/>
+    <w:basedOn w:val="701"/>
     <w:uiPriority w:val="99"/>
     <w:pPr>
       <w:pBdr/>
@@ -4014,9 +4010,9 @@
       </w:tcPr>
     </w:tblStylePr>
   </w:style>
-  <w:style w:type="table" w:styleId="22">
+  <w:style w:type="table" w:styleId="712">
     <w:name w:val="Grid Table 1 Light - Accent 3"/>
-    <w:basedOn w:val="11"/>
+    <w:basedOn w:val="701"/>
     <w:uiPriority w:val="99"/>
     <w:pPr>
       <w:pBdr/>
@@ -4237,9 +4233,9 @@
       </w:tcPr>
     </w:tblStylePr>
   </w:style>
-  <w:style w:type="table" w:styleId="23">
+  <w:style w:type="table" w:styleId="713">
     <w:name w:val="Grid Table 1 Light - Accent 4"/>
-    <w:basedOn w:val="11"/>
+    <w:basedOn w:val="701"/>
     <w:uiPriority w:val="99"/>
     <w:pPr>
       <w:pBdr/>
@@ -4460,9 +4456,9 @@
       </w:tcPr>
     </w:tblStylePr>
   </w:style>
-  <w:style w:type="table" w:styleId="24">
+  <w:style w:type="table" w:styleId="714">
     <w:name w:val="Grid Table 1 Light - Accent 5"/>
-    <w:basedOn w:val="11"/>
+    <w:basedOn w:val="701"/>
     <w:uiPriority w:val="99"/>
     <w:pPr>
       <w:pBdr/>
@@ -4683,9 +4679,9 @@
       </w:tcPr>
     </w:tblStylePr>
   </w:style>
-  <w:style w:type="table" w:styleId="25">
+  <w:style w:type="table" w:styleId="715">
     <w:name w:val="Grid Table 1 Light - Accent 6"/>
-    <w:basedOn w:val="11"/>
+    <w:basedOn w:val="701"/>
     <w:uiPriority w:val="99"/>
     <w:pPr>
       <w:pBdr/>
@@ -4906,9 +4902,9 @@
       </w:tcPr>
     </w:tblStylePr>
   </w:style>
-  <w:style w:type="table" w:styleId="26">
+  <w:style w:type="table" w:styleId="716">
     <w:name w:val="Grid Table 2"/>
-    <w:basedOn w:val="11"/>
+    <w:basedOn w:val="701"/>
     <w:uiPriority w:val="99"/>
     <w:pPr>
       <w:pBdr/>
@@ -5138,9 +5134,9 @@
       </w:tcPr>
     </w:tblStylePr>
   </w:style>
-  <w:style w:type="table" w:styleId="27">
+  <w:style w:type="table" w:styleId="717">
     <w:name w:val="Grid Table 2 - Accent 1"/>
-    <w:basedOn w:val="11"/>
+    <w:basedOn w:val="701"/>
     <w:uiPriority w:val="99"/>
     <w:pPr>
       <w:pBdr/>
@@ -5370,9 +5366,9 @@
       </w:tcPr>
     </w:tblStylePr>
   </w:style>
-  <w:style w:type="table" w:styleId="28">
+  <w:style w:type="table" w:styleId="718">
     <w:name w:val="Grid Table 2 - Accent 2"/>
-    <w:basedOn w:val="11"/>
+    <w:basedOn w:val="701"/>
     <w:uiPriority w:val="99"/>
     <w:pPr>
       <w:pBdr/>
@@ -5602,9 +5598,9 @@
       </w:tcPr>
     </w:tblStylePr>
   </w:style>
-  <w:style w:type="table" w:styleId="29">
+  <w:style w:type="table" w:styleId="719">
     <w:name w:val="Grid Table 2 - Accent 3"/>
-    <w:basedOn w:val="11"/>
+    <w:basedOn w:val="701"/>
     <w:uiPriority w:val="99"/>
     <w:pPr>
       <w:pBdr/>
@@ -5834,9 +5830,9 @@
       </w:tcPr>
     </w:tblStylePr>
   </w:style>
-  <w:style w:type="table" w:styleId="30">
+  <w:style w:type="table" w:styleId="720">
     <w:name w:val="Grid Table 2 - Accent 4"/>
-    <w:basedOn w:val="11"/>
+    <w:basedOn w:val="701"/>
     <w:uiPriority w:val="99"/>
     <w:pPr>
       <w:pBdr/>
@@ -6066,9 +6062,9 @@
       </w:tcPr>
     </w:tblStylePr>
   </w:style>
-  <w:style w:type="table" w:styleId="31">
+  <w:style w:type="table" w:styleId="721">
     <w:name w:val="Grid Table 2 - Accent 5"/>
-    <w:basedOn w:val="11"/>
+    <w:basedOn w:val="701"/>
     <w:uiPriority w:val="99"/>
     <w:pPr>
       <w:pBdr/>
@@ -6298,9 +6294,9 @@
       </w:tcPr>
     </w:tblStylePr>
   </w:style>
-  <w:style w:type="table" w:styleId="32">
+  <w:style w:type="table" w:styleId="722">
     <w:name w:val="Grid Table 2 - Accent 6"/>
-    <w:basedOn w:val="11"/>
+    <w:basedOn w:val="701"/>
     <w:uiPriority w:val="99"/>
     <w:pPr>
       <w:pBdr/>
@@ -6530,9 +6526,9 @@
       </w:tcPr>
     </w:tblStylePr>
   </w:style>
-  <w:style w:type="table" w:styleId="33">
+  <w:style w:type="table" w:styleId="723">
     <w:name w:val="Grid Table 3"/>
-    <w:basedOn w:val="11"/>
+    <w:basedOn w:val="701"/>
     <w:uiPriority w:val="99"/>
     <w:pPr>
       <w:pBdr/>
@@ -6631,29 +6627,6 @@
         <w:tblBorders/>
       </w:tblPr>
       <w:tcPr>
-        <w:shd w:color="ffffff"/>
-        <w:tcBorders>
-          <w:top w:val="none" w:color="000000" w:sz="4" w:space="0"/>
-          <w:left w:val="none" w:color="000000" w:sz="4" w:space="0"/>
-          <w:bottom w:val="none" w:color="000000" w:sz="4" w:space="0"/>
-          <w:right w:val="none" w:color="000000" w:sz="4" w:space="0"/>
-        </w:tcBorders>
-      </w:tcPr>
-    </w:tblStylePr>
-    <w:tblStylePr w:type="firstRow">
-      <w:rPr>
-        <w:b/>
-        <w:color w:val="404040"/>
-      </w:rPr>
-      <w:pPr>
-        <w:pBdr/>
-        <w:spacing/>
-        <w:ind/>
-      </w:pPr>
-      <w:tblPr>
-        <w:tblBorders/>
-      </w:tblPr>
-      <w:tcPr>
         <w:shd w:val="clear" w:color="ffffff"/>
         <w:tcBorders>
           <w:top w:val="none" w:color="000000" w:sz="4" w:space="0"/>
@@ -6663,30 +6636,7 @@
         </w:tcBorders>
       </w:tcPr>
     </w:tblStylePr>
-    <w:tblStylePr w:type="lastCol">
-      <w:rPr>
-        <w:i/>
-        <w:color w:val="404040"/>
-      </w:rPr>
-      <w:pPr>
-        <w:pBdr/>
-        <w:spacing/>
-        <w:ind/>
-      </w:pPr>
-      <w:tblPr>
-        <w:tblBorders/>
-      </w:tblPr>
-      <w:tcPr>
-        <w:shd w:color="ffffff"/>
-        <w:tcBorders>
-          <w:top w:val="none" w:color="000000" w:sz="4" w:space="0"/>
-          <w:left w:val="none" w:color="000000" w:sz="4" w:space="0"/>
-          <w:bottom w:val="none" w:color="000000" w:sz="4" w:space="0"/>
-          <w:right w:val="none" w:color="000000" w:sz="4" w:space="0"/>
-        </w:tcBorders>
-      </w:tcPr>
-    </w:tblStylePr>
-    <w:tblStylePr w:type="lastRow">
+    <w:tblStylePr w:type="firstRow">
       <w:rPr>
         <w:b/>
         <w:color w:val="404040"/>
@@ -6709,6 +6659,52 @@
         </w:tcBorders>
       </w:tcPr>
     </w:tblStylePr>
+    <w:tblStylePr w:type="lastCol">
+      <w:rPr>
+        <w:i/>
+        <w:color w:val="404040"/>
+      </w:rPr>
+      <w:pPr>
+        <w:pBdr/>
+        <w:spacing/>
+        <w:ind/>
+      </w:pPr>
+      <w:tblPr>
+        <w:tblBorders/>
+      </w:tblPr>
+      <w:tcPr>
+        <w:shd w:val="clear" w:color="ffffff"/>
+        <w:tcBorders>
+          <w:top w:val="none" w:color="000000" w:sz="4" w:space="0"/>
+          <w:left w:val="none" w:color="000000" w:sz="4" w:space="0"/>
+          <w:bottom w:val="none" w:color="000000" w:sz="4" w:space="0"/>
+          <w:right w:val="none" w:color="000000" w:sz="4" w:space="0"/>
+        </w:tcBorders>
+      </w:tcPr>
+    </w:tblStylePr>
+    <w:tblStylePr w:type="lastRow">
+      <w:rPr>
+        <w:b/>
+        <w:color w:val="404040"/>
+      </w:rPr>
+      <w:pPr>
+        <w:pBdr/>
+        <w:spacing/>
+        <w:ind/>
+      </w:pPr>
+      <w:tblPr>
+        <w:tblBorders/>
+      </w:tblPr>
+      <w:tcPr>
+        <w:shd w:val="clear" w:color="ffffff"/>
+        <w:tcBorders>
+          <w:top w:val="none" w:color="000000" w:sz="4" w:space="0"/>
+          <w:left w:val="none" w:color="000000" w:sz="4" w:space="0"/>
+          <w:bottom w:val="none" w:color="000000" w:sz="4" w:space="0"/>
+          <w:right w:val="none" w:color="000000" w:sz="4" w:space="0"/>
+        </w:tcBorders>
+      </w:tcPr>
+    </w:tblStylePr>
     <w:tblStylePr w:type="nwCell">
       <w:pPr>
         <w:pBdr/>
@@ -6775,9 +6771,9 @@
       </w:tcPr>
     </w:tblStylePr>
   </w:style>
-  <w:style w:type="table" w:styleId="34">
+  <w:style w:type="table" w:styleId="724">
     <w:name w:val="Grid Table 3 - Accent 1"/>
-    <w:basedOn w:val="11"/>
+    <w:basedOn w:val="701"/>
     <w:uiPriority w:val="99"/>
     <w:pPr>
       <w:pBdr/>
@@ -6876,29 +6872,6 @@
         <w:tblBorders/>
       </w:tblPr>
       <w:tcPr>
-        <w:shd w:color="ffffff"/>
-        <w:tcBorders>
-          <w:top w:val="none" w:color="000000" w:sz="4" w:space="0"/>
-          <w:left w:val="none" w:color="000000" w:sz="4" w:space="0"/>
-          <w:bottom w:val="none" w:color="000000" w:sz="4" w:space="0"/>
-          <w:right w:val="none" w:color="000000" w:sz="4" w:space="0"/>
-        </w:tcBorders>
-      </w:tcPr>
-    </w:tblStylePr>
-    <w:tblStylePr w:type="firstRow">
-      <w:rPr>
-        <w:b/>
-        <w:color w:val="404040"/>
-      </w:rPr>
-      <w:pPr>
-        <w:pBdr/>
-        <w:spacing/>
-        <w:ind/>
-      </w:pPr>
-      <w:tblPr>
-        <w:tblBorders/>
-      </w:tblPr>
-      <w:tcPr>
         <w:shd w:val="clear" w:color="ffffff"/>
         <w:tcBorders>
           <w:top w:val="none" w:color="000000" w:sz="4" w:space="0"/>
@@ -6908,30 +6881,7 @@
         </w:tcBorders>
       </w:tcPr>
     </w:tblStylePr>
-    <w:tblStylePr w:type="lastCol">
-      <w:rPr>
-        <w:i/>
-        <w:color w:val="404040"/>
-      </w:rPr>
-      <w:pPr>
-        <w:pBdr/>
-        <w:spacing/>
-        <w:ind/>
-      </w:pPr>
-      <w:tblPr>
-        <w:tblBorders/>
-      </w:tblPr>
-      <w:tcPr>
-        <w:shd w:color="ffffff"/>
-        <w:tcBorders>
-          <w:top w:val="none" w:color="000000" w:sz="4" w:space="0"/>
-          <w:left w:val="none" w:color="000000" w:sz="4" w:space="0"/>
-          <w:bottom w:val="none" w:color="000000" w:sz="4" w:space="0"/>
-          <w:right w:val="none" w:color="000000" w:sz="4" w:space="0"/>
-        </w:tcBorders>
-      </w:tcPr>
-    </w:tblStylePr>
-    <w:tblStylePr w:type="lastRow">
+    <w:tblStylePr w:type="firstRow">
       <w:rPr>
         <w:b/>
         <w:color w:val="404040"/>
@@ -6954,6 +6904,52 @@
         </w:tcBorders>
       </w:tcPr>
     </w:tblStylePr>
+    <w:tblStylePr w:type="lastCol">
+      <w:rPr>
+        <w:i/>
+        <w:color w:val="404040"/>
+      </w:rPr>
+      <w:pPr>
+        <w:pBdr/>
+        <w:spacing/>
+        <w:ind/>
+      </w:pPr>
+      <w:tblPr>
+        <w:tblBorders/>
+      </w:tblPr>
+      <w:tcPr>
+        <w:shd w:val="clear" w:color="ffffff"/>
+        <w:tcBorders>
+          <w:top w:val="none" w:color="000000" w:sz="4" w:space="0"/>
+          <w:left w:val="none" w:color="000000" w:sz="4" w:space="0"/>
+          <w:bottom w:val="none" w:color="000000" w:sz="4" w:space="0"/>
+          <w:right w:val="none" w:color="000000" w:sz="4" w:space="0"/>
+        </w:tcBorders>
+      </w:tcPr>
+    </w:tblStylePr>
+    <w:tblStylePr w:type="lastRow">
+      <w:rPr>
+        <w:b/>
+        <w:color w:val="404040"/>
+      </w:rPr>
+      <w:pPr>
+        <w:pBdr/>
+        <w:spacing/>
+        <w:ind/>
+      </w:pPr>
+      <w:tblPr>
+        <w:tblBorders/>
+      </w:tblPr>
+      <w:tcPr>
+        <w:shd w:val="clear" w:color="ffffff"/>
+        <w:tcBorders>
+          <w:top w:val="none" w:color="000000" w:sz="4" w:space="0"/>
+          <w:left w:val="none" w:color="000000" w:sz="4" w:space="0"/>
+          <w:bottom w:val="none" w:color="000000" w:sz="4" w:space="0"/>
+          <w:right w:val="none" w:color="000000" w:sz="4" w:space="0"/>
+        </w:tcBorders>
+      </w:tcPr>
+    </w:tblStylePr>
     <w:tblStylePr w:type="nwCell">
       <w:pPr>
         <w:pBdr/>
@@ -7020,9 +7016,9 @@
       </w:tcPr>
     </w:tblStylePr>
   </w:style>
-  <w:style w:type="table" w:styleId="35">
+  <w:style w:type="table" w:styleId="725">
     <w:name w:val="Grid Table 3 - Accent 2"/>
-    <w:basedOn w:val="11"/>
+    <w:basedOn w:val="701"/>
     <w:uiPriority w:val="99"/>
     <w:pPr>
       <w:pBdr/>
@@ -7121,29 +7117,6 @@
         <w:tblBorders/>
       </w:tblPr>
       <w:tcPr>
-        <w:shd w:color="ffffff"/>
-        <w:tcBorders>
-          <w:top w:val="none" w:color="000000" w:sz="4" w:space="0"/>
-          <w:left w:val="none" w:color="000000" w:sz="4" w:space="0"/>
-          <w:bottom w:val="none" w:color="000000" w:sz="4" w:space="0"/>
-          <w:right w:val="none" w:color="000000" w:sz="4" w:space="0"/>
-        </w:tcBorders>
-      </w:tcPr>
-    </w:tblStylePr>
-    <w:tblStylePr w:type="firstRow">
-      <w:rPr>
-        <w:b/>
-        <w:color w:val="404040"/>
-      </w:rPr>
-      <w:pPr>
-        <w:pBdr/>
-        <w:spacing/>
-        <w:ind/>
-      </w:pPr>
-      <w:tblPr>
-        <w:tblBorders/>
-      </w:tblPr>
-      <w:tcPr>
         <w:shd w:val="clear" w:color="ffffff"/>
         <w:tcBorders>
           <w:top w:val="none" w:color="000000" w:sz="4" w:space="0"/>
@@ -7153,30 +7126,7 @@
         </w:tcBorders>
       </w:tcPr>
     </w:tblStylePr>
-    <w:tblStylePr w:type="lastCol">
-      <w:rPr>
-        <w:i/>
-        <w:color w:val="404040"/>
-      </w:rPr>
-      <w:pPr>
-        <w:pBdr/>
-        <w:spacing/>
-        <w:ind/>
-      </w:pPr>
-      <w:tblPr>
-        <w:tblBorders/>
-      </w:tblPr>
-      <w:tcPr>
-        <w:shd w:color="ffffff"/>
-        <w:tcBorders>
-          <w:top w:val="none" w:color="000000" w:sz="4" w:space="0"/>
-          <w:left w:val="none" w:color="000000" w:sz="4" w:space="0"/>
-          <w:bottom w:val="none" w:color="000000" w:sz="4" w:space="0"/>
-          <w:right w:val="none" w:color="000000" w:sz="4" w:space="0"/>
-        </w:tcBorders>
-      </w:tcPr>
-    </w:tblStylePr>
-    <w:tblStylePr w:type="lastRow">
+    <w:tblStylePr w:type="firstRow">
       <w:rPr>
         <w:b/>
         <w:color w:val="404040"/>
@@ -7199,6 +7149,52 @@
         </w:tcBorders>
       </w:tcPr>
     </w:tblStylePr>
+    <w:tblStylePr w:type="lastCol">
+      <w:rPr>
+        <w:i/>
+        <w:color w:val="404040"/>
+      </w:rPr>
+      <w:pPr>
+        <w:pBdr/>
+        <w:spacing/>
+        <w:ind/>
+      </w:pPr>
+      <w:tblPr>
+        <w:tblBorders/>
+      </w:tblPr>
+      <w:tcPr>
+        <w:shd w:val="clear" w:color="ffffff"/>
+        <w:tcBorders>
+          <w:top w:val="none" w:color="000000" w:sz="4" w:space="0"/>
+          <w:left w:val="none" w:color="000000" w:sz="4" w:space="0"/>
+          <w:bottom w:val="none" w:color="000000" w:sz="4" w:space="0"/>
+          <w:right w:val="none" w:color="000000" w:sz="4" w:space="0"/>
+        </w:tcBorders>
+      </w:tcPr>
+    </w:tblStylePr>
+    <w:tblStylePr w:type="lastRow">
+      <w:rPr>
+        <w:b/>
+        <w:color w:val="404040"/>
+      </w:rPr>
+      <w:pPr>
+        <w:pBdr/>
+        <w:spacing/>
+        <w:ind/>
+      </w:pPr>
+      <w:tblPr>
+        <w:tblBorders/>
+      </w:tblPr>
+      <w:tcPr>
+        <w:shd w:val="clear" w:color="ffffff"/>
+        <w:tcBorders>
+          <w:top w:val="none" w:color="000000" w:sz="4" w:space="0"/>
+          <w:left w:val="none" w:color="000000" w:sz="4" w:space="0"/>
+          <w:bottom w:val="none" w:color="000000" w:sz="4" w:space="0"/>
+          <w:right w:val="none" w:color="000000" w:sz="4" w:space="0"/>
+        </w:tcBorders>
+      </w:tcPr>
+    </w:tblStylePr>
     <w:tblStylePr w:type="nwCell">
       <w:pPr>
         <w:pBdr/>
@@ -7265,9 +7261,9 @@
       </w:tcPr>
     </w:tblStylePr>
   </w:style>
-  <w:style w:type="table" w:styleId="36">
+  <w:style w:type="table" w:styleId="726">
     <w:name w:val="Grid Table 3 - Accent 3"/>
-    <w:basedOn w:val="11"/>
+    <w:basedOn w:val="701"/>
     <w:uiPriority w:val="99"/>
     <w:pPr>
       <w:pBdr/>
@@ -7366,29 +7362,6 @@
         <w:tblBorders/>
       </w:tblPr>
       <w:tcPr>
-        <w:shd w:color="ffffff"/>
-        <w:tcBorders>
-          <w:top w:val="none" w:color="000000" w:sz="4" w:space="0"/>
-          <w:left w:val="none" w:color="000000" w:sz="4" w:space="0"/>
-          <w:bottom w:val="none" w:color="000000" w:sz="4" w:space="0"/>
-          <w:right w:val="none" w:color="000000" w:sz="4" w:space="0"/>
-        </w:tcBorders>
-      </w:tcPr>
-    </w:tblStylePr>
-    <w:tblStylePr w:type="firstRow">
-      <w:rPr>
-        <w:b/>
-        <w:color w:val="404040"/>
-      </w:rPr>
-      <w:pPr>
-        <w:pBdr/>
-        <w:spacing/>
-        <w:ind/>
-      </w:pPr>
-      <w:tblPr>
-        <w:tblBorders/>
-      </w:tblPr>
-      <w:tcPr>
         <w:shd w:val="clear" w:color="ffffff"/>
         <w:tcBorders>
           <w:top w:val="none" w:color="000000" w:sz="4" w:space="0"/>
@@ -7398,30 +7371,7 @@
         </w:tcBorders>
       </w:tcPr>
     </w:tblStylePr>
-    <w:tblStylePr w:type="lastCol">
-      <w:rPr>
-        <w:i/>
-        <w:color w:val="404040"/>
-      </w:rPr>
-      <w:pPr>
-        <w:pBdr/>
-        <w:spacing/>
-        <w:ind/>
-      </w:pPr>
-      <w:tblPr>
-        <w:tblBorders/>
-      </w:tblPr>
-      <w:tcPr>
-        <w:shd w:color="ffffff"/>
-        <w:tcBorders>
-          <w:top w:val="none" w:color="000000" w:sz="4" w:space="0"/>
-          <w:left w:val="none" w:color="000000" w:sz="4" w:space="0"/>
-          <w:bottom w:val="none" w:color="000000" w:sz="4" w:space="0"/>
-          <w:right w:val="none" w:color="000000" w:sz="4" w:space="0"/>
-        </w:tcBorders>
-      </w:tcPr>
-    </w:tblStylePr>
-    <w:tblStylePr w:type="lastRow">
+    <w:tblStylePr w:type="firstRow">
       <w:rPr>
         <w:b/>
         <w:color w:val="404040"/>
@@ -7444,6 +7394,52 @@
         </w:tcBorders>
       </w:tcPr>
     </w:tblStylePr>
+    <w:tblStylePr w:type="lastCol">
+      <w:rPr>
+        <w:i/>
+        <w:color w:val="404040"/>
+      </w:rPr>
+      <w:pPr>
+        <w:pBdr/>
+        <w:spacing/>
+        <w:ind/>
+      </w:pPr>
+      <w:tblPr>
+        <w:tblBorders/>
+      </w:tblPr>
+      <w:tcPr>
+        <w:shd w:val="clear" w:color="ffffff"/>
+        <w:tcBorders>
+          <w:top w:val="none" w:color="000000" w:sz="4" w:space="0"/>
+          <w:left w:val="none" w:color="000000" w:sz="4" w:space="0"/>
+          <w:bottom w:val="none" w:color="000000" w:sz="4" w:space="0"/>
+          <w:right w:val="none" w:color="000000" w:sz="4" w:space="0"/>
+        </w:tcBorders>
+      </w:tcPr>
+    </w:tblStylePr>
+    <w:tblStylePr w:type="lastRow">
+      <w:rPr>
+        <w:b/>
+        <w:color w:val="404040"/>
+      </w:rPr>
+      <w:pPr>
+        <w:pBdr/>
+        <w:spacing/>
+        <w:ind/>
+      </w:pPr>
+      <w:tblPr>
+        <w:tblBorders/>
+      </w:tblPr>
+      <w:tcPr>
+        <w:shd w:val="clear" w:color="ffffff"/>
+        <w:tcBorders>
+          <w:top w:val="none" w:color="000000" w:sz="4" w:space="0"/>
+          <w:left w:val="none" w:color="000000" w:sz="4" w:space="0"/>
+          <w:bottom w:val="none" w:color="000000" w:sz="4" w:space="0"/>
+          <w:right w:val="none" w:color="000000" w:sz="4" w:space="0"/>
+        </w:tcBorders>
+      </w:tcPr>
+    </w:tblStylePr>
     <w:tblStylePr w:type="nwCell">
       <w:pPr>
         <w:pBdr/>
@@ -7510,9 +7506,9 @@
       </w:tcPr>
     </w:tblStylePr>
   </w:style>
-  <w:style w:type="table" w:styleId="37">
+  <w:style w:type="table" w:styleId="727">
     <w:name w:val="Grid Table 3 - Accent 4"/>
-    <w:basedOn w:val="11"/>
+    <w:basedOn w:val="701"/>
     <w:uiPriority w:val="99"/>
     <w:pPr>
       <w:pBdr/>
@@ -7611,29 +7607,6 @@
         <w:tblBorders/>
       </w:tblPr>
       <w:tcPr>
-        <w:shd w:color="ffffff"/>
-        <w:tcBorders>
-          <w:top w:val="none" w:color="000000" w:sz="4" w:space="0"/>
-          <w:left w:val="none" w:color="000000" w:sz="4" w:space="0"/>
-          <w:bottom w:val="none" w:color="000000" w:sz="4" w:space="0"/>
-          <w:right w:val="none" w:color="000000" w:sz="4" w:space="0"/>
-        </w:tcBorders>
-      </w:tcPr>
-    </w:tblStylePr>
-    <w:tblStylePr w:type="firstRow">
-      <w:rPr>
-        <w:b/>
-        <w:color w:val="404040"/>
-      </w:rPr>
-      <w:pPr>
-        <w:pBdr/>
-        <w:spacing/>
-        <w:ind/>
-      </w:pPr>
-      <w:tblPr>
-        <w:tblBorders/>
-      </w:tblPr>
-      <w:tcPr>
         <w:shd w:val="clear" w:color="ffffff"/>
         <w:tcBorders>
           <w:top w:val="none" w:color="000000" w:sz="4" w:space="0"/>
@@ -7643,30 +7616,7 @@
         </w:tcBorders>
       </w:tcPr>
     </w:tblStylePr>
-    <w:tblStylePr w:type="lastCol">
-      <w:rPr>
-        <w:i/>
-        <w:color w:val="404040"/>
-      </w:rPr>
-      <w:pPr>
-        <w:pBdr/>
-        <w:spacing/>
-        <w:ind/>
-      </w:pPr>
-      <w:tblPr>
-        <w:tblBorders/>
-      </w:tblPr>
-      <w:tcPr>
-        <w:shd w:color="ffffff"/>
-        <w:tcBorders>
-          <w:top w:val="none" w:color="000000" w:sz="4" w:space="0"/>
-          <w:left w:val="none" w:color="000000" w:sz="4" w:space="0"/>
-          <w:bottom w:val="none" w:color="000000" w:sz="4" w:space="0"/>
-          <w:right w:val="none" w:color="000000" w:sz="4" w:space="0"/>
-        </w:tcBorders>
-      </w:tcPr>
-    </w:tblStylePr>
-    <w:tblStylePr w:type="lastRow">
+    <w:tblStylePr w:type="firstRow">
       <w:rPr>
         <w:b/>
         <w:color w:val="404040"/>
@@ -7689,6 +7639,52 @@
         </w:tcBorders>
       </w:tcPr>
     </w:tblStylePr>
+    <w:tblStylePr w:type="lastCol">
+      <w:rPr>
+        <w:i/>
+        <w:color w:val="404040"/>
+      </w:rPr>
+      <w:pPr>
+        <w:pBdr/>
+        <w:spacing/>
+        <w:ind/>
+      </w:pPr>
+      <w:tblPr>
+        <w:tblBorders/>
+      </w:tblPr>
+      <w:tcPr>
+        <w:shd w:val="clear" w:color="ffffff"/>
+        <w:tcBorders>
+          <w:top w:val="none" w:color="000000" w:sz="4" w:space="0"/>
+          <w:left w:val="none" w:color="000000" w:sz="4" w:space="0"/>
+          <w:bottom w:val="none" w:color="000000" w:sz="4" w:space="0"/>
+          <w:right w:val="none" w:color="000000" w:sz="4" w:space="0"/>
+        </w:tcBorders>
+      </w:tcPr>
+    </w:tblStylePr>
+    <w:tblStylePr w:type="lastRow">
+      <w:rPr>
+        <w:b/>
+        <w:color w:val="404040"/>
+      </w:rPr>
+      <w:pPr>
+        <w:pBdr/>
+        <w:spacing/>
+        <w:ind/>
+      </w:pPr>
+      <w:tblPr>
+        <w:tblBorders/>
+      </w:tblPr>
+      <w:tcPr>
+        <w:shd w:val="clear" w:color="ffffff"/>
+        <w:tcBorders>
+          <w:top w:val="none" w:color="000000" w:sz="4" w:space="0"/>
+          <w:left w:val="none" w:color="000000" w:sz="4" w:space="0"/>
+          <w:bottom w:val="none" w:color="000000" w:sz="4" w:space="0"/>
+          <w:right w:val="none" w:color="000000" w:sz="4" w:space="0"/>
+        </w:tcBorders>
+      </w:tcPr>
+    </w:tblStylePr>
     <w:tblStylePr w:type="nwCell">
       <w:pPr>
         <w:pBdr/>
@@ -7755,9 +7751,9 @@
       </w:tcPr>
     </w:tblStylePr>
   </w:style>
-  <w:style w:type="table" w:styleId="38">
+  <w:style w:type="table" w:styleId="728">
     <w:name w:val="Grid Table 3 - Accent 5"/>
-    <w:basedOn w:val="11"/>
+    <w:basedOn w:val="701"/>
     <w:uiPriority w:val="99"/>
     <w:pPr>
       <w:pBdr/>
@@ -7856,29 +7852,6 @@
         <w:tblBorders/>
       </w:tblPr>
       <w:tcPr>
-        <w:shd w:color="ffffff"/>
-        <w:tcBorders>
-          <w:top w:val="none" w:color="000000" w:sz="4" w:space="0"/>
-          <w:left w:val="none" w:color="000000" w:sz="4" w:space="0"/>
-          <w:bottom w:val="none" w:color="000000" w:sz="4" w:space="0"/>
-          <w:right w:val="none" w:color="000000" w:sz="4" w:space="0"/>
-        </w:tcBorders>
-      </w:tcPr>
-    </w:tblStylePr>
-    <w:tblStylePr w:type="firstRow">
-      <w:rPr>
-        <w:b/>
-        <w:color w:val="404040"/>
-      </w:rPr>
-      <w:pPr>
-        <w:pBdr/>
-        <w:spacing/>
-        <w:ind/>
-      </w:pPr>
-      <w:tblPr>
-        <w:tblBorders/>
-      </w:tblPr>
-      <w:tcPr>
         <w:shd w:val="clear" w:color="ffffff"/>
         <w:tcBorders>
           <w:top w:val="none" w:color="000000" w:sz="4" w:space="0"/>
@@ -7888,30 +7861,7 @@
         </w:tcBorders>
       </w:tcPr>
     </w:tblStylePr>
-    <w:tblStylePr w:type="lastCol">
-      <w:rPr>
-        <w:i/>
-        <w:color w:val="404040"/>
-      </w:rPr>
-      <w:pPr>
-        <w:pBdr/>
-        <w:spacing/>
-        <w:ind/>
-      </w:pPr>
-      <w:tblPr>
-        <w:tblBorders/>
-      </w:tblPr>
-      <w:tcPr>
-        <w:shd w:color="ffffff"/>
-        <w:tcBorders>
-          <w:top w:val="none" w:color="000000" w:sz="4" w:space="0"/>
-          <w:left w:val="none" w:color="000000" w:sz="4" w:space="0"/>
-          <w:bottom w:val="none" w:color="000000" w:sz="4" w:space="0"/>
-          <w:right w:val="none" w:color="000000" w:sz="4" w:space="0"/>
-        </w:tcBorders>
-      </w:tcPr>
-    </w:tblStylePr>
-    <w:tblStylePr w:type="lastRow">
+    <w:tblStylePr w:type="firstRow">
       <w:rPr>
         <w:b/>
         <w:color w:val="404040"/>
@@ -7934,6 +7884,52 @@
         </w:tcBorders>
       </w:tcPr>
     </w:tblStylePr>
+    <w:tblStylePr w:type="lastCol">
+      <w:rPr>
+        <w:i/>
+        <w:color w:val="404040"/>
+      </w:rPr>
+      <w:pPr>
+        <w:pBdr/>
+        <w:spacing/>
+        <w:ind/>
+      </w:pPr>
+      <w:tblPr>
+        <w:tblBorders/>
+      </w:tblPr>
+      <w:tcPr>
+        <w:shd w:val="clear" w:color="ffffff"/>
+        <w:tcBorders>
+          <w:top w:val="none" w:color="000000" w:sz="4" w:space="0"/>
+          <w:left w:val="none" w:color="000000" w:sz="4" w:space="0"/>
+          <w:bottom w:val="none" w:color="000000" w:sz="4" w:space="0"/>
+          <w:right w:val="none" w:color="000000" w:sz="4" w:space="0"/>
+        </w:tcBorders>
+      </w:tcPr>
+    </w:tblStylePr>
+    <w:tblStylePr w:type="lastRow">
+      <w:rPr>
+        <w:b/>
+        <w:color w:val="404040"/>
+      </w:rPr>
+      <w:pPr>
+        <w:pBdr/>
+        <w:spacing/>
+        <w:ind/>
+      </w:pPr>
+      <w:tblPr>
+        <w:tblBorders/>
+      </w:tblPr>
+      <w:tcPr>
+        <w:shd w:val="clear" w:color="ffffff"/>
+        <w:tcBorders>
+          <w:top w:val="none" w:color="000000" w:sz="4" w:space="0"/>
+          <w:left w:val="none" w:color="000000" w:sz="4" w:space="0"/>
+          <w:bottom w:val="none" w:color="000000" w:sz="4" w:space="0"/>
+          <w:right w:val="none" w:color="000000" w:sz="4" w:space="0"/>
+        </w:tcBorders>
+      </w:tcPr>
+    </w:tblStylePr>
     <w:tblStylePr w:type="nwCell">
       <w:pPr>
         <w:pBdr/>
@@ -8000,9 +7996,9 @@
       </w:tcPr>
     </w:tblStylePr>
   </w:style>
-  <w:style w:type="table" w:styleId="39">
+  <w:style w:type="table" w:styleId="729">
     <w:name w:val="Grid Table 3 - Accent 6"/>
-    <w:basedOn w:val="11"/>
+    <w:basedOn w:val="701"/>
     <w:uiPriority w:val="99"/>
     <w:pPr>
       <w:pBdr/>
@@ -8101,29 +8097,6 @@
         <w:tblBorders/>
       </w:tblPr>
       <w:tcPr>
-        <w:shd w:color="ffffff"/>
-        <w:tcBorders>
-          <w:top w:val="none" w:color="000000" w:sz="4" w:space="0"/>
-          <w:left w:val="none" w:color="000000" w:sz="4" w:space="0"/>
-          <w:bottom w:val="none" w:color="000000" w:sz="4" w:space="0"/>
-          <w:right w:val="none" w:color="000000" w:sz="4" w:space="0"/>
-        </w:tcBorders>
-      </w:tcPr>
-    </w:tblStylePr>
-    <w:tblStylePr w:type="firstRow">
-      <w:rPr>
-        <w:b/>
-        <w:color w:val="404040"/>
-      </w:rPr>
-      <w:pPr>
-        <w:pBdr/>
-        <w:spacing/>
-        <w:ind/>
-      </w:pPr>
-      <w:tblPr>
-        <w:tblBorders/>
-      </w:tblPr>
-      <w:tcPr>
         <w:shd w:val="clear" w:color="ffffff"/>
         <w:tcBorders>
           <w:top w:val="none" w:color="000000" w:sz="4" w:space="0"/>
@@ -8133,30 +8106,7 @@
         </w:tcBorders>
       </w:tcPr>
     </w:tblStylePr>
-    <w:tblStylePr w:type="lastCol">
-      <w:rPr>
-        <w:i/>
-        <w:color w:val="404040"/>
-      </w:rPr>
-      <w:pPr>
-        <w:pBdr/>
-        <w:spacing/>
-        <w:ind/>
-      </w:pPr>
-      <w:tblPr>
-        <w:tblBorders/>
-      </w:tblPr>
-      <w:tcPr>
-        <w:shd w:color="ffffff"/>
-        <w:tcBorders>
-          <w:top w:val="none" w:color="000000" w:sz="4" w:space="0"/>
-          <w:left w:val="none" w:color="000000" w:sz="4" w:space="0"/>
-          <w:bottom w:val="none" w:color="000000" w:sz="4" w:space="0"/>
-          <w:right w:val="none" w:color="000000" w:sz="4" w:space="0"/>
-        </w:tcBorders>
-      </w:tcPr>
-    </w:tblStylePr>
-    <w:tblStylePr w:type="lastRow">
+    <w:tblStylePr w:type="firstRow">
       <w:rPr>
         <w:b/>
         <w:color w:val="404040"/>
@@ -8179,6 +8129,52 @@
         </w:tcBorders>
       </w:tcPr>
     </w:tblStylePr>
+    <w:tblStylePr w:type="lastCol">
+      <w:rPr>
+        <w:i/>
+        <w:color w:val="404040"/>
+      </w:rPr>
+      <w:pPr>
+        <w:pBdr/>
+        <w:spacing/>
+        <w:ind/>
+      </w:pPr>
+      <w:tblPr>
+        <w:tblBorders/>
+      </w:tblPr>
+      <w:tcPr>
+        <w:shd w:val="clear" w:color="ffffff"/>
+        <w:tcBorders>
+          <w:top w:val="none" w:color="000000" w:sz="4" w:space="0"/>
+          <w:left w:val="none" w:color="000000" w:sz="4" w:space="0"/>
+          <w:bottom w:val="none" w:color="000000" w:sz="4" w:space="0"/>
+          <w:right w:val="none" w:color="000000" w:sz="4" w:space="0"/>
+        </w:tcBorders>
+      </w:tcPr>
+    </w:tblStylePr>
+    <w:tblStylePr w:type="lastRow">
+      <w:rPr>
+        <w:b/>
+        <w:color w:val="404040"/>
+      </w:rPr>
+      <w:pPr>
+        <w:pBdr/>
+        <w:spacing/>
+        <w:ind/>
+      </w:pPr>
+      <w:tblPr>
+        <w:tblBorders/>
+      </w:tblPr>
+      <w:tcPr>
+        <w:shd w:val="clear" w:color="ffffff"/>
+        <w:tcBorders>
+          <w:top w:val="none" w:color="000000" w:sz="4" w:space="0"/>
+          <w:left w:val="none" w:color="000000" w:sz="4" w:space="0"/>
+          <w:bottom w:val="none" w:color="000000" w:sz="4" w:space="0"/>
+          <w:right w:val="none" w:color="000000" w:sz="4" w:space="0"/>
+        </w:tcBorders>
+      </w:tcPr>
+    </w:tblStylePr>
     <w:tblStylePr w:type="nwCell">
       <w:pPr>
         <w:pBdr/>
@@ -8245,9 +8241,9 @@
       </w:tcPr>
     </w:tblStylePr>
   </w:style>
-  <w:style w:type="table" w:styleId="40">
+  <w:style w:type="table" w:styleId="730">
     <w:name w:val="Grid Table 4"/>
-    <w:basedOn w:val="11"/>
+    <w:basedOn w:val="701"/>
     <w:uiPriority w:val="59"/>
     <w:pPr>
       <w:pBdr/>
@@ -8478,9 +8474,9 @@
       </w:tcPr>
     </w:tblStylePr>
   </w:style>
-  <w:style w:type="table" w:styleId="41">
+  <w:style w:type="table" w:styleId="731">
     <w:name w:val="Grid Table 4 - Accent 1"/>
-    <w:basedOn w:val="11"/>
+    <w:basedOn w:val="701"/>
     <w:uiPriority w:val="59"/>
     <w:pPr>
       <w:pBdr/>
@@ -8711,9 +8707,9 @@
       </w:tcPr>
     </w:tblStylePr>
   </w:style>
-  <w:style w:type="table" w:styleId="42">
+  <w:style w:type="table" w:styleId="732">
     <w:name w:val="Grid Table 4 - Accent 2"/>
-    <w:basedOn w:val="11"/>
+    <w:basedOn w:val="701"/>
     <w:uiPriority w:val="59"/>
     <w:pPr>
       <w:pBdr/>
@@ -8944,9 +8940,9 @@
       </w:tcPr>
     </w:tblStylePr>
   </w:style>
-  <w:style w:type="table" w:styleId="43">
+  <w:style w:type="table" w:styleId="733">
     <w:name w:val="Grid Table 4 - Accent 3"/>
-    <w:basedOn w:val="11"/>
+    <w:basedOn w:val="701"/>
     <w:uiPriority w:val="59"/>
     <w:pPr>
       <w:pBdr/>
@@ -9177,9 +9173,9 @@
       </w:tcPr>
     </w:tblStylePr>
   </w:style>
-  <w:style w:type="table" w:styleId="44">
+  <w:style w:type="table" w:styleId="734">
     <w:name w:val="Grid Table 4 - Accent 4"/>
-    <w:basedOn w:val="11"/>
+    <w:basedOn w:val="701"/>
     <w:uiPriority w:val="59"/>
     <w:pPr>
       <w:pBdr/>
@@ -9410,9 +9406,9 @@
       </w:tcPr>
     </w:tblStylePr>
   </w:style>
-  <w:style w:type="table" w:styleId="45">
+  <w:style w:type="table" w:styleId="735">
     <w:name w:val="Grid Table 4 - Accent 5"/>
-    <w:basedOn w:val="11"/>
+    <w:basedOn w:val="701"/>
     <w:uiPriority w:val="59"/>
     <w:pPr>
       <w:pBdr/>
@@ -9643,9 +9639,9 @@
       </w:tcPr>
     </w:tblStylePr>
   </w:style>
-  <w:style w:type="table" w:styleId="46">
+  <w:style w:type="table" w:styleId="736">
     <w:name w:val="Grid Table 4 - Accent 6"/>
-    <w:basedOn w:val="11"/>
+    <w:basedOn w:val="701"/>
     <w:uiPriority w:val="59"/>
     <w:pPr>
       <w:pBdr/>
@@ -9876,9 +9872,9 @@
       </w:tcPr>
     </w:tblStylePr>
   </w:style>
-  <w:style w:type="table" w:styleId="47">
+  <w:style w:type="table" w:styleId="737">
     <w:name w:val="Grid Table 5 Dark"/>
-    <w:basedOn w:val="11"/>
+    <w:basedOn w:val="701"/>
     <w:uiPriority w:val="99"/>
     <w:pPr>
       <w:pBdr/>
@@ -10104,9 +10100,9 @@
       </w:tcPr>
     </w:tblStylePr>
   </w:style>
-  <w:style w:type="table" w:styleId="48">
+  <w:style w:type="table" w:styleId="738">
     <w:name w:val="Grid Table 5 Dark- Accent 1"/>
-    <w:basedOn w:val="11"/>
+    <w:basedOn w:val="701"/>
     <w:uiPriority w:val="99"/>
     <w:pPr>
       <w:pBdr/>
@@ -10332,9 +10328,9 @@
       </w:tcPr>
     </w:tblStylePr>
   </w:style>
-  <w:style w:type="table" w:styleId="49">
+  <w:style w:type="table" w:styleId="739">
     <w:name w:val="Grid Table 5 Dark - Accent 2"/>
-    <w:basedOn w:val="11"/>
+    <w:basedOn w:val="701"/>
     <w:uiPriority w:val="99"/>
     <w:pPr>
       <w:pBdr/>
@@ -10560,9 +10556,9 @@
       </w:tcPr>
     </w:tblStylePr>
   </w:style>
-  <w:style w:type="table" w:styleId="50">
+  <w:style w:type="table" w:styleId="740">
     <w:name w:val="Grid Table 5 Dark - Accent 3"/>
-    <w:basedOn w:val="11"/>
+    <w:basedOn w:val="701"/>
     <w:uiPriority w:val="99"/>
     <w:pPr>
       <w:pBdr/>
@@ -10788,9 +10784,9 @@
       </w:tcPr>
     </w:tblStylePr>
   </w:style>
-  <w:style w:type="table" w:styleId="51">
+  <w:style w:type="table" w:styleId="741">
     <w:name w:val="Grid Table 5 Dark- Accent 4"/>
-    <w:basedOn w:val="11"/>
+    <w:basedOn w:val="701"/>
     <w:uiPriority w:val="99"/>
     <w:pPr>
       <w:pBdr/>
@@ -11016,9 +11012,9 @@
       </w:tcPr>
     </w:tblStylePr>
   </w:style>
-  <w:style w:type="table" w:styleId="52">
+  <w:style w:type="table" w:styleId="742">
     <w:name w:val="Grid Table 5 Dark - Accent 5"/>
-    <w:basedOn w:val="11"/>
+    <w:basedOn w:val="701"/>
     <w:uiPriority w:val="99"/>
     <w:pPr>
       <w:pBdr/>
@@ -11244,9 +11240,9 @@
       </w:tcPr>
     </w:tblStylePr>
   </w:style>
-  <w:style w:type="table" w:styleId="53">
+  <w:style w:type="table" w:styleId="743">
     <w:name w:val="Grid Table 5 Dark - Accent 6"/>
-    <w:basedOn w:val="11"/>
+    <w:basedOn w:val="701"/>
     <w:uiPriority w:val="99"/>
     <w:pPr>
       <w:pBdr/>
@@ -11472,9 +11468,9 @@
       </w:tcPr>
     </w:tblStylePr>
   </w:style>
-  <w:style w:type="table" w:styleId="54">
+  <w:style w:type="table" w:styleId="744">
     <w:name w:val="Grid Table 6 Colorful"/>
-    <w:basedOn w:val="11"/>
+    <w:basedOn w:val="701"/>
     <w:uiPriority w:val="99"/>
     <w:pPr>
       <w:pBdr/>
@@ -11702,9 +11698,9 @@
       </w:tcPr>
     </w:tblStylePr>
   </w:style>
-  <w:style w:type="table" w:styleId="55">
+  <w:style w:type="table" w:styleId="745">
     <w:name w:val="Grid Table 6 Colorful - Accent 1"/>
-    <w:basedOn w:val="11"/>
+    <w:basedOn w:val="701"/>
     <w:uiPriority w:val="99"/>
     <w:pPr>
       <w:pBdr/>
@@ -11932,9 +11928,9 @@
       </w:tcPr>
     </w:tblStylePr>
   </w:style>
-  <w:style w:type="table" w:styleId="56">
+  <w:style w:type="table" w:styleId="746">
     <w:name w:val="Grid Table 6 Colorful - Accent 2"/>
-    <w:basedOn w:val="11"/>
+    <w:basedOn w:val="701"/>
     <w:uiPriority w:val="99"/>
     <w:pPr>
       <w:pBdr/>
@@ -12162,9 +12158,9 @@
       </w:tcPr>
     </w:tblStylePr>
   </w:style>
-  <w:style w:type="table" w:styleId="57">
+  <w:style w:type="table" w:styleId="747">
     <w:name w:val="Grid Table 6 Colorful - Accent 3"/>
-    <w:basedOn w:val="11"/>
+    <w:basedOn w:val="701"/>
     <w:uiPriority w:val="99"/>
     <w:pPr>
       <w:pBdr/>
@@ -12392,9 +12388,9 @@
       </w:tcPr>
     </w:tblStylePr>
   </w:style>
-  <w:style w:type="table" w:styleId="58">
+  <w:style w:type="table" w:styleId="748">
     <w:name w:val="Grid Table 6 Colorful - Accent 4"/>
-    <w:basedOn w:val="11"/>
+    <w:basedOn w:val="701"/>
     <w:uiPriority w:val="99"/>
     <w:pPr>
       <w:pBdr/>
@@ -12622,9 +12618,9 @@
       </w:tcPr>
     </w:tblStylePr>
   </w:style>
-  <w:style w:type="table" w:styleId="59">
+  <w:style w:type="table" w:styleId="749">
     <w:name w:val="Grid Table 6 Colorful - Accent 5"/>
-    <w:basedOn w:val="11"/>
+    <w:basedOn w:val="701"/>
     <w:uiPriority w:val="99"/>
     <w:pPr>
       <w:pBdr/>
@@ -12852,9 +12848,9 @@
       </w:tcPr>
     </w:tblStylePr>
   </w:style>
-  <w:style w:type="table" w:styleId="60">
+  <w:style w:type="table" w:styleId="750">
     <w:name w:val="Grid Table 6 Colorful - Accent 6"/>
-    <w:basedOn w:val="11"/>
+    <w:basedOn w:val="701"/>
     <w:uiPriority w:val="99"/>
     <w:pPr>
       <w:pBdr/>
@@ -13082,9 +13078,9 @@
       </w:tcPr>
     </w:tblStylePr>
   </w:style>
-  <w:style w:type="table" w:styleId="61">
+  <w:style w:type="table" w:styleId="751">
     <w:name w:val="Grid Table 7 Colorful"/>
-    <w:basedOn w:val="11"/>
+    <w:basedOn w:val="701"/>
     <w:uiPriority w:val="99"/>
     <w:pPr>
       <w:pBdr/>
@@ -13186,11 +13182,11 @@
         <w:tblBorders/>
       </w:tblPr>
       <w:tcPr>
-        <w:shd w:color="ffffff"/>
+        <w:shd w:val="clear" w:color="ffffff"/>
         <w:tcBorders>
-          <w:top w:val="none"/>
-          <w:left w:val="none"/>
-          <w:bottom w:val="none"/>
+          <w:top w:val="none" w:color="000000" w:sz="4" w:space="0"/>
+          <w:left w:val="none" w:color="000000" w:sz="4" w:space="0"/>
+          <w:bottom w:val="none" w:color="000000" w:sz="4" w:space="0"/>
           <w:right w:val="single" w:color="000000" w:themeColor="text1" w:themeTint="80" w:sz="4" w:space="0"/>
         </w:tcBorders>
       </w:tcPr>
@@ -13213,10 +13209,10 @@
       <w:tcPr>
         <w:shd w:val="clear" w:color="ffffff" w:themeColor="light1" w:fill="ffffff" w:themeFill="light1"/>
         <w:tcBorders>
-          <w:top w:val="none"/>
-          <w:left w:val="none"/>
+          <w:top w:val="none" w:color="000000" w:sz="4" w:space="0"/>
+          <w:left w:val="none" w:color="000000" w:sz="4" w:space="0"/>
           <w:bottom w:val="single" w:color="000000" w:themeColor="text1" w:themeTint="80" w:sz="4" w:space="0"/>
-          <w:right w:val="none"/>
+          <w:right w:val="none" w:color="000000" w:sz="4" w:space="0"/>
         </w:tcBorders>
       </w:tcPr>
     </w:tblStylePr>
@@ -13236,12 +13232,12 @@
         <w:tblBorders/>
       </w:tblPr>
       <w:tcPr>
-        <w:shd w:color="ffffff"/>
+        <w:shd w:val="clear" w:color="ffffff"/>
         <w:tcBorders>
-          <w:top w:val="none"/>
+          <w:top w:val="none" w:color="000000" w:sz="4" w:space="0"/>
           <w:left w:val="single" w:color="000000" w:themeColor="text1" w:themeTint="80" w:sz="4" w:space="0"/>
-          <w:bottom w:val="none"/>
-          <w:right w:val="none"/>
+          <w:bottom w:val="none" w:color="000000" w:sz="4" w:space="0"/>
+          <w:right w:val="none" w:color="000000" w:sz="4" w:space="0"/>
         </w:tcBorders>
       </w:tcPr>
     </w:tblStylePr>
@@ -13264,9 +13260,9 @@
         <w:shd w:val="clear" w:color="ffffff" w:themeColor="light1" w:fill="ffffff" w:themeFill="light1"/>
         <w:tcBorders>
           <w:top w:val="single" w:color="000000" w:themeColor="text1" w:themeTint="80" w:sz="4" w:space="0"/>
-          <w:left w:val="none"/>
-          <w:bottom w:val="none"/>
-          <w:right w:val="none"/>
+          <w:left w:val="none" w:color="000000" w:sz="4" w:space="0"/>
+          <w:bottom w:val="none" w:color="000000" w:sz="4" w:space="0"/>
+          <w:right w:val="none" w:color="000000" w:sz="4" w:space="0"/>
         </w:tcBorders>
       </w:tcPr>
     </w:tblStylePr>
@@ -13336,9 +13332,9 @@
       </w:tcPr>
     </w:tblStylePr>
   </w:style>
-  <w:style w:type="table" w:styleId="62">
+  <w:style w:type="table" w:styleId="752">
     <w:name w:val="Grid Table 7 Colorful - Accent 1"/>
-    <w:basedOn w:val="11"/>
+    <w:basedOn w:val="701"/>
     <w:uiPriority w:val="99"/>
     <w:pPr>
       <w:pBdr/>
@@ -13440,11 +13436,11 @@
         <w:tblBorders/>
       </w:tblPr>
       <w:tcPr>
-        <w:shd w:color="ffffff"/>
+        <w:shd w:val="clear" w:color="ffffff"/>
         <w:tcBorders>
-          <w:top w:val="none"/>
-          <w:left w:val="none"/>
-          <w:bottom w:val="none"/>
+          <w:top w:val="none" w:color="000000" w:sz="4" w:space="0"/>
+          <w:left w:val="none" w:color="000000" w:sz="4" w:space="0"/>
+          <w:bottom w:val="none" w:color="000000" w:sz="4" w:space="0"/>
           <w:right w:val="single" w:color="000000" w:themeColor="accent1" w:themeTint="80" w:sz="4" w:space="0"/>
         </w:tcBorders>
       </w:tcPr>
@@ -13467,10 +13463,10 @@
       <w:tcPr>
         <w:shd w:val="clear" w:color="ffffff" w:themeColor="light1" w:fill="ffffff" w:themeFill="light1"/>
         <w:tcBorders>
-          <w:top w:val="none"/>
-          <w:left w:val="none"/>
+          <w:top w:val="none" w:color="000000" w:sz="4" w:space="0"/>
+          <w:left w:val="none" w:color="000000" w:sz="4" w:space="0"/>
           <w:bottom w:val="single" w:color="000000" w:themeColor="accent1" w:themeTint="80" w:sz="4" w:space="0"/>
-          <w:right w:val="none"/>
+          <w:right w:val="none" w:color="000000" w:sz="4" w:space="0"/>
         </w:tcBorders>
       </w:tcPr>
     </w:tblStylePr>
@@ -13490,12 +13486,12 @@
         <w:tblBorders/>
       </w:tblPr>
       <w:tcPr>
-        <w:shd w:color="ffffff"/>
+        <w:shd w:val="clear" w:color="ffffff"/>
         <w:tcBorders>
-          <w:top w:val="none"/>
+          <w:top w:val="none" w:color="000000" w:sz="4" w:space="0"/>
           <w:left w:val="single" w:color="000000" w:themeColor="accent1" w:themeTint="80" w:sz="4" w:space="0"/>
-          <w:bottom w:val="none"/>
-          <w:right w:val="none"/>
+          <w:bottom w:val="none" w:color="000000" w:sz="4" w:space="0"/>
+          <w:right w:val="none" w:color="000000" w:sz="4" w:space="0"/>
         </w:tcBorders>
       </w:tcPr>
     </w:tblStylePr>
@@ -13518,9 +13514,9 @@
         <w:shd w:val="clear" w:color="ffffff" w:themeColor="light1" w:fill="ffffff" w:themeFill="light1"/>
         <w:tcBorders>
           <w:top w:val="single" w:color="000000" w:themeColor="accent1" w:themeTint="80" w:sz="4" w:space="0"/>
-          <w:left w:val="none"/>
-          <w:bottom w:val="none"/>
-          <w:right w:val="none"/>
+          <w:left w:val="none" w:color="000000" w:sz="4" w:space="0"/>
+          <w:bottom w:val="none" w:color="000000" w:sz="4" w:space="0"/>
+          <w:right w:val="none" w:color="000000" w:sz="4" w:space="0"/>
         </w:tcBorders>
       </w:tcPr>
     </w:tblStylePr>
@@ -13590,9 +13586,9 @@
       </w:tcPr>
     </w:tblStylePr>
   </w:style>
-  <w:style w:type="table" w:styleId="63">
+  <w:style w:type="table" w:styleId="753">
     <w:name w:val="Grid Table 7 Colorful - Accent 2"/>
-    <w:basedOn w:val="11"/>
+    <w:basedOn w:val="701"/>
     <w:uiPriority w:val="99"/>
     <w:pPr>
       <w:pBdr/>
@@ -13694,11 +13690,11 @@
         <w:tblBorders/>
       </w:tblPr>
       <w:tcPr>
-        <w:shd w:color="ffffff"/>
+        <w:shd w:val="clear" w:color="ffffff"/>
         <w:tcBorders>
-          <w:top w:val="none"/>
-          <w:left w:val="none"/>
-          <w:bottom w:val="none"/>
+          <w:top w:val="none" w:color="000000" w:sz="4" w:space="0"/>
+          <w:left w:val="none" w:color="000000" w:sz="4" w:space="0"/>
+          <w:bottom w:val="none" w:color="000000" w:sz="4" w:space="0"/>
           <w:right w:val="single" w:color="000000" w:themeColor="accent2" w:themeTint="97" w:sz="4" w:space="0"/>
         </w:tcBorders>
       </w:tcPr>
@@ -13721,10 +13717,10 @@
       <w:tcPr>
         <w:shd w:val="clear" w:color="ffffff" w:themeColor="light1" w:fill="ffffff" w:themeFill="light1"/>
         <w:tcBorders>
-          <w:top w:val="none"/>
-          <w:left w:val="none"/>
+          <w:top w:val="none" w:color="000000" w:sz="4" w:space="0"/>
+          <w:left w:val="none" w:color="000000" w:sz="4" w:space="0"/>
           <w:bottom w:val="single" w:color="000000" w:themeColor="accent2" w:themeTint="97" w:sz="4" w:space="0"/>
-          <w:right w:val="none"/>
+          <w:right w:val="none" w:color="000000" w:sz="4" w:space="0"/>
         </w:tcBorders>
       </w:tcPr>
     </w:tblStylePr>
@@ -13744,12 +13740,12 @@
         <w:tblBorders/>
       </w:tblPr>
       <w:tcPr>
-        <w:shd w:color="ffffff"/>
+        <w:shd w:val="clear" w:color="ffffff"/>
         <w:tcBorders>
-          <w:top w:val="none"/>
+          <w:top w:val="none" w:color="000000" w:sz="4" w:space="0"/>
           <w:left w:val="single" w:color="000000" w:themeColor="accent2" w:themeTint="97" w:sz="4" w:space="0"/>
-          <w:bottom w:val="none"/>
-          <w:right w:val="none"/>
+          <w:bottom w:val="none" w:color="000000" w:sz="4" w:space="0"/>
+          <w:right w:val="none" w:color="000000" w:sz="4" w:space="0"/>
         </w:tcBorders>
       </w:tcPr>
     </w:tblStylePr>
@@ -13772,9 +13768,9 @@
         <w:shd w:val="clear" w:color="ffffff" w:themeColor="light1" w:fill="ffffff" w:themeFill="light1"/>
         <w:tcBorders>
           <w:top w:val="single" w:color="000000" w:themeColor="accent2" w:themeTint="97" w:sz="4" w:space="0"/>
-          <w:left w:val="none"/>
-          <w:bottom w:val="none"/>
-          <w:right w:val="none"/>
+          <w:left w:val="none" w:color="000000" w:sz="4" w:space="0"/>
+          <w:bottom w:val="none" w:color="000000" w:sz="4" w:space="0"/>
+          <w:right w:val="none" w:color="000000" w:sz="4" w:space="0"/>
         </w:tcBorders>
       </w:tcPr>
     </w:tblStylePr>
@@ -13844,9 +13840,9 @@
       </w:tcPr>
     </w:tblStylePr>
   </w:style>
-  <w:style w:type="table" w:styleId="64">
+  <w:style w:type="table" w:styleId="754">
     <w:name w:val="Grid Table 7 Colorful - Accent 3"/>
-    <w:basedOn w:val="11"/>
+    <w:basedOn w:val="701"/>
     <w:uiPriority w:val="99"/>
     <w:pPr>
       <w:pBdr/>
@@ -13948,11 +13944,11 @@
         <w:tblBorders/>
       </w:tblPr>
       <w:tcPr>
-        <w:shd w:color="ffffff"/>
+        <w:shd w:val="clear" w:color="ffffff"/>
         <w:tcBorders>
-          <w:top w:val="none"/>
-          <w:left w:val="none"/>
-          <w:bottom w:val="none"/>
+          <w:top w:val="none" w:color="000000" w:sz="4" w:space="0"/>
+          <w:left w:val="none" w:color="000000" w:sz="4" w:space="0"/>
+          <w:bottom w:val="none" w:color="000000" w:sz="4" w:space="0"/>
           <w:right w:val="single" w:color="000000" w:themeColor="accent3" w:themeTint="FE" w:sz="4" w:space="0"/>
         </w:tcBorders>
       </w:tcPr>
@@ -13975,10 +13971,10 @@
       <w:tcPr>
         <w:shd w:val="clear" w:color="ffffff" w:themeColor="light1" w:fill="ffffff" w:themeFill="light1"/>
         <w:tcBorders>
-          <w:top w:val="none"/>
-          <w:left w:val="none"/>
+          <w:top w:val="none" w:color="000000" w:sz="4" w:space="0"/>
+          <w:left w:val="none" w:color="000000" w:sz="4" w:space="0"/>
           <w:bottom w:val="single" w:color="000000" w:themeColor="accent3" w:themeTint="FE" w:sz="4" w:space="0"/>
-          <w:right w:val="none"/>
+          <w:right w:val="none" w:color="000000" w:sz="4" w:space="0"/>
         </w:tcBorders>
       </w:tcPr>
     </w:tblStylePr>
@@ -13998,12 +13994,12 @@
         <w:tblBorders/>
       </w:tblPr>
       <w:tcPr>
-        <w:shd w:color="ffffff"/>
+        <w:shd w:val="clear" w:color="ffffff"/>
         <w:tcBorders>
-          <w:top w:val="none"/>
+          <w:top w:val="none" w:color="000000" w:sz="4" w:space="0"/>
           <w:left w:val="single" w:color="000000" w:themeColor="accent3" w:themeTint="FE" w:sz="4" w:space="0"/>
-          <w:bottom w:val="none"/>
-          <w:right w:val="none"/>
+          <w:bottom w:val="none" w:color="000000" w:sz="4" w:space="0"/>
+          <w:right w:val="none" w:color="000000" w:sz="4" w:space="0"/>
         </w:tcBorders>
       </w:tcPr>
     </w:tblStylePr>
@@ -14026,9 +14022,9 @@
         <w:shd w:val="clear" w:color="ffffff" w:themeColor="light1" w:fill="ffffff" w:themeFill="light1"/>
         <w:tcBorders>
           <w:top w:val="single" w:color="000000" w:themeColor="accent3" w:themeTint="FE" w:sz="4" w:space="0"/>
-          <w:left w:val="none"/>
-          <w:bottom w:val="none"/>
-          <w:right w:val="none"/>
+          <w:left w:val="none" w:color="000000" w:sz="4" w:space="0"/>
+          <w:bottom w:val="none" w:color="000000" w:sz="4" w:space="0"/>
+          <w:right w:val="none" w:color="000000" w:sz="4" w:space="0"/>
         </w:tcBorders>
       </w:tcPr>
     </w:tblStylePr>
@@ -14098,9 +14094,9 @@
       </w:tcPr>
     </w:tblStylePr>
   </w:style>
-  <w:style w:type="table" w:styleId="65">
+  <w:style w:type="table" w:styleId="755">
     <w:name w:val="Grid Table 7 Colorful - Accent 4"/>
-    <w:basedOn w:val="11"/>
+    <w:basedOn w:val="701"/>
     <w:uiPriority w:val="99"/>
     <w:pPr>
       <w:pBdr/>
@@ -14202,11 +14198,11 @@
         <w:tblBorders/>
       </w:tblPr>
       <w:tcPr>
-        <w:shd w:color="ffffff"/>
+        <w:shd w:val="clear" w:color="ffffff"/>
         <w:tcBorders>
-          <w:top w:val="none"/>
-          <w:left w:val="none"/>
-          <w:bottom w:val="none"/>
+          <w:top w:val="none" w:color="000000" w:sz="4" w:space="0"/>
+          <w:left w:val="none" w:color="000000" w:sz="4" w:space="0"/>
+          <w:bottom w:val="none" w:color="000000" w:sz="4" w:space="0"/>
           <w:right w:val="single" w:color="000000" w:themeColor="accent4" w:themeTint="9A" w:sz="4" w:space="0"/>
         </w:tcBorders>
       </w:tcPr>
@@ -14229,10 +14225,10 @@
       <w:tcPr>
         <w:shd w:val="clear" w:color="ffffff" w:themeColor="light1" w:fill="ffffff" w:themeFill="light1"/>
         <w:tcBorders>
-          <w:top w:val="none"/>
-          <w:left w:val="none"/>
+          <w:top w:val="none" w:color="000000" w:sz="4" w:space="0"/>
+          <w:left w:val="none" w:color="000000" w:sz="4" w:space="0"/>
           <w:bottom w:val="single" w:color="000000" w:themeColor="accent4" w:themeTint="9A" w:sz="4" w:space="0"/>
-          <w:right w:val="none"/>
+          <w:right w:val="none" w:color="000000" w:sz="4" w:space="0"/>
         </w:tcBorders>
       </w:tcPr>
     </w:tblStylePr>
@@ -14252,12 +14248,12 @@
         <w:tblBorders/>
       </w:tblPr>
       <w:tcPr>
-        <w:shd w:color="ffffff"/>
+        <w:shd w:val="clear" w:color="ffffff"/>
         <w:tcBorders>
-          <w:top w:val="none"/>
+          <w:top w:val="none" w:color="000000" w:sz="4" w:space="0"/>
           <w:left w:val="single" w:color="000000" w:themeColor="accent4" w:themeTint="9A" w:sz="4" w:space="0"/>
-          <w:bottom w:val="none"/>
-          <w:right w:val="none"/>
+          <w:bottom w:val="none" w:color="000000" w:sz="4" w:space="0"/>
+          <w:right w:val="none" w:color="000000" w:sz="4" w:space="0"/>
         </w:tcBorders>
       </w:tcPr>
     </w:tblStylePr>
@@ -14280,9 +14276,9 @@
         <w:shd w:val="clear" w:color="ffffff" w:themeColor="light1" w:fill="ffffff" w:themeFill="light1"/>
         <w:tcBorders>
           <w:top w:val="single" w:color="000000" w:themeColor="accent4" w:themeTint="9A" w:sz="4" w:space="0"/>
-          <w:left w:val="none"/>
-          <w:bottom w:val="none"/>
-          <w:right w:val="none"/>
+          <w:left w:val="none" w:color="000000" w:sz="4" w:space="0"/>
+          <w:bottom w:val="none" w:color="000000" w:sz="4" w:space="0"/>
+          <w:right w:val="none" w:color="000000" w:sz="4" w:space="0"/>
         </w:tcBorders>
       </w:tcPr>
     </w:tblStylePr>
@@ -14352,9 +14348,9 @@
       </w:tcPr>
     </w:tblStylePr>
   </w:style>
-  <w:style w:type="table" w:styleId="66">
+  <w:style w:type="table" w:styleId="756">
     <w:name w:val="Grid Table 7 Colorful - Accent 5"/>
-    <w:basedOn w:val="11"/>
+    <w:basedOn w:val="701"/>
     <w:uiPriority w:val="99"/>
     <w:pPr>
       <w:pBdr/>
@@ -14456,11 +14452,11 @@
         <w:tblBorders/>
       </w:tblPr>
       <w:tcPr>
-        <w:shd w:color="ffffff"/>
+        <w:shd w:val="clear" w:color="ffffff"/>
         <w:tcBorders>
-          <w:top w:val="none"/>
-          <w:left w:val="none"/>
-          <w:bottom w:val="none"/>
+          <w:top w:val="none" w:color="000000" w:sz="4" w:space="0"/>
+          <w:left w:val="none" w:color="000000" w:sz="4" w:space="0"/>
+          <w:bottom w:val="none" w:color="000000" w:sz="4" w:space="0"/>
           <w:right w:val="single" w:color="000000" w:themeColor="accent5" w:themeTint="90" w:sz="4" w:space="0"/>
         </w:tcBorders>
       </w:tcPr>
@@ -14483,10 +14479,10 @@
       <w:tcPr>
         <w:shd w:val="clear" w:color="ffffff" w:themeColor="light1" w:fill="ffffff" w:themeFill="light1"/>
         <w:tcBorders>
-          <w:top w:val="none"/>
-          <w:left w:val="none"/>
+          <w:top w:val="none" w:color="000000" w:sz="4" w:space="0"/>
+          <w:left w:val="none" w:color="000000" w:sz="4" w:space="0"/>
           <w:bottom w:val="single" w:color="000000" w:themeColor="accent5" w:themeTint="90" w:sz="4" w:space="0"/>
-          <w:right w:val="none"/>
+          <w:right w:val="none" w:color="000000" w:sz="4" w:space="0"/>
         </w:tcBorders>
       </w:tcPr>
     </w:tblStylePr>
@@ -14506,12 +14502,12 @@
         <w:tblBorders/>
       </w:tblPr>
       <w:tcPr>
-        <w:shd w:color="ffffff"/>
+        <w:shd w:val="clear" w:color="ffffff"/>
         <w:tcBorders>
-          <w:top w:val="none"/>
+          <w:top w:val="none" w:color="000000" w:sz="4" w:space="0"/>
           <w:left w:val="single" w:color="000000" w:themeColor="accent5" w:themeTint="90" w:sz="4" w:space="0"/>
-          <w:bottom w:val="none"/>
-          <w:right w:val="none"/>
+          <w:bottom w:val="none" w:color="000000" w:sz="4" w:space="0"/>
+          <w:right w:val="none" w:color="000000" w:sz="4" w:space="0"/>
         </w:tcBorders>
       </w:tcPr>
     </w:tblStylePr>
@@ -14534,9 +14530,9 @@
         <w:shd w:val="clear" w:color="ffffff" w:themeColor="light1" w:fill="ffffff" w:themeFill="light1"/>
         <w:tcBorders>
           <w:top w:val="single" w:color="000000" w:themeColor="accent5" w:themeTint="90" w:sz="4" w:space="0"/>
-          <w:left w:val="none"/>
-          <w:bottom w:val="none"/>
-          <w:right w:val="none"/>
+          <w:left w:val="none" w:color="000000" w:sz="4" w:space="0"/>
+          <w:bottom w:val="none" w:color="000000" w:sz="4" w:space="0"/>
+          <w:right w:val="none" w:color="000000" w:sz="4" w:space="0"/>
         </w:tcBorders>
       </w:tcPr>
     </w:tblStylePr>
@@ -14606,9 +14602,9 @@
       </w:tcPr>
     </w:tblStylePr>
   </w:style>
-  <w:style w:type="table" w:styleId="67">
+  <w:style w:type="table" w:styleId="757">
     <w:name w:val="Grid Table 7 Colorful - Accent 6"/>
-    <w:basedOn w:val="11"/>
+    <w:basedOn w:val="701"/>
     <w:uiPriority w:val="99"/>
     <w:pPr>
       <w:pBdr/>
@@ -14710,11 +14706,11 @@
         <w:tblBorders/>
       </w:tblPr>
       <w:tcPr>
-        <w:shd w:color="ffffff"/>
+        <w:shd w:val="clear" w:color="ffffff"/>
         <w:tcBorders>
-          <w:top w:val="none"/>
-          <w:left w:val="none"/>
-          <w:bottom w:val="none"/>
+          <w:top w:val="none" w:color="000000" w:sz="4" w:space="0"/>
+          <w:left w:val="none" w:color="000000" w:sz="4" w:space="0"/>
+          <w:bottom w:val="none" w:color="000000" w:sz="4" w:space="0"/>
           <w:right w:val="single" w:color="000000" w:themeColor="accent6" w:themeTint="90" w:sz="4" w:space="0"/>
         </w:tcBorders>
       </w:tcPr>
@@ -14737,10 +14733,10 @@
       <w:tcPr>
         <w:shd w:val="clear" w:color="ffffff" w:themeColor="light1" w:fill="ffffff" w:themeFill="light1"/>
         <w:tcBorders>
-          <w:top w:val="none"/>
-          <w:left w:val="none"/>
+          <w:top w:val="none" w:color="000000" w:sz="4" w:space="0"/>
+          <w:left w:val="none" w:color="000000" w:sz="4" w:space="0"/>
           <w:bottom w:val="single" w:color="000000" w:themeColor="accent6" w:themeTint="90" w:sz="4" w:space="0"/>
-          <w:right w:val="none"/>
+          <w:right w:val="none" w:color="000000" w:sz="4" w:space="0"/>
         </w:tcBorders>
       </w:tcPr>
     </w:tblStylePr>
@@ -14760,12 +14756,12 @@
         <w:tblBorders/>
       </w:tblPr>
       <w:tcPr>
-        <w:shd w:color="ffffff"/>
+        <w:shd w:val="clear" w:color="ffffff"/>
         <w:tcBorders>
-          <w:top w:val="none"/>
+          <w:top w:val="none" w:color="000000" w:sz="4" w:space="0"/>
           <w:left w:val="single" w:color="000000" w:themeColor="accent6" w:themeTint="90" w:sz="4" w:space="0"/>
-          <w:bottom w:val="none"/>
-          <w:right w:val="none"/>
+          <w:bottom w:val="none" w:color="000000" w:sz="4" w:space="0"/>
+          <w:right w:val="none" w:color="000000" w:sz="4" w:space="0"/>
         </w:tcBorders>
       </w:tcPr>
     </w:tblStylePr>
@@ -14788,9 +14784,9 @@
         <w:shd w:val="clear" w:color="ffffff" w:themeColor="light1" w:fill="ffffff" w:themeFill="light1"/>
         <w:tcBorders>
           <w:top w:val="single" w:color="000000" w:themeColor="accent6" w:themeTint="90" w:sz="4" w:space="0"/>
-          <w:left w:val="none"/>
-          <w:bottom w:val="none"/>
-          <w:right w:val="none"/>
+          <w:left w:val="none" w:color="000000" w:sz="4" w:space="0"/>
+          <w:bottom w:val="none" w:color="000000" w:sz="4" w:space="0"/>
+          <w:right w:val="none" w:color="000000" w:sz="4" w:space="0"/>
         </w:tcBorders>
       </w:tcPr>
     </w:tblStylePr>
@@ -14860,9 +14856,9 @@
       </w:tcPr>
     </w:tblStylePr>
   </w:style>
-  <w:style w:type="table" w:styleId="68">
+  <w:style w:type="table" w:styleId="758">
     <w:name w:val="List Table 1 Light"/>
-    <w:basedOn w:val="11"/>
+    <w:basedOn w:val="701"/>
     <w:uiPriority w:val="99"/>
     <w:pPr>
       <w:pBdr/>
@@ -15076,9 +15072,9 @@
       </w:tcPr>
     </w:tblStylePr>
   </w:style>
-  <w:style w:type="table" w:styleId="69">
+  <w:style w:type="table" w:styleId="759">
     <w:name w:val="List Table 1 Light - Accent 1"/>
-    <w:basedOn w:val="11"/>
+    <w:basedOn w:val="701"/>
     <w:uiPriority w:val="99"/>
     <w:pPr>
       <w:pBdr/>
@@ -15292,9 +15288,9 @@
       </w:tcPr>
     </w:tblStylePr>
   </w:style>
-  <w:style w:type="table" w:styleId="70">
+  <w:style w:type="table" w:styleId="760">
     <w:name w:val="List Table 1 Light - Accent 2"/>
-    <w:basedOn w:val="11"/>
+    <w:basedOn w:val="701"/>
     <w:uiPriority w:val="99"/>
     <w:pPr>
       <w:pBdr/>
@@ -15508,9 +15504,9 @@
       </w:tcPr>
     </w:tblStylePr>
   </w:style>
-  <w:style w:type="table" w:styleId="71">
+  <w:style w:type="table" w:styleId="761">
     <w:name w:val="List Table 1 Light - Accent 3"/>
-    <w:basedOn w:val="11"/>
+    <w:basedOn w:val="701"/>
     <w:uiPriority w:val="99"/>
     <w:pPr>
       <w:pBdr/>
@@ -15724,9 +15720,9 @@
       </w:tcPr>
     </w:tblStylePr>
   </w:style>
-  <w:style w:type="table" w:styleId="72">
+  <w:style w:type="table" w:styleId="762">
     <w:name w:val="List Table 1 Light - Accent 4"/>
-    <w:basedOn w:val="11"/>
+    <w:basedOn w:val="701"/>
     <w:uiPriority w:val="99"/>
     <w:pPr>
       <w:pBdr/>
@@ -15940,9 +15936,9 @@
       </w:tcPr>
     </w:tblStylePr>
   </w:style>
-  <w:style w:type="table" w:styleId="73">
+  <w:style w:type="table" w:styleId="763">
     <w:name w:val="List Table 1 Light - Accent 5"/>
-    <w:basedOn w:val="11"/>
+    <w:basedOn w:val="701"/>
     <w:uiPriority w:val="99"/>
     <w:pPr>
       <w:pBdr/>
@@ -16156,9 +16152,9 @@
       </w:tcPr>
     </w:tblStylePr>
   </w:style>
-  <w:style w:type="table" w:styleId="74">
+  <w:style w:type="table" w:styleId="764">
     <w:name w:val="List Table 1 Light - Accent 6"/>
-    <w:basedOn w:val="11"/>
+    <w:basedOn w:val="701"/>
     <w:uiPriority w:val="99"/>
     <w:pPr>
       <w:pBdr/>
@@ -16372,9 +16368,9 @@
       </w:tcPr>
     </w:tblStylePr>
   </w:style>
-  <w:style w:type="table" w:styleId="75">
+  <w:style w:type="table" w:styleId="765">
     <w:name w:val="List Table 2"/>
-    <w:basedOn w:val="11"/>
+    <w:basedOn w:val="701"/>
     <w:uiPriority w:val="99"/>
     <w:pPr>
       <w:pBdr/>
@@ -16610,9 +16606,9 @@
       </w:tcPr>
     </w:tblStylePr>
   </w:style>
-  <w:style w:type="table" w:styleId="76">
+  <w:style w:type="table" w:styleId="766">
     <w:name w:val="List Table 2 - Accent 1"/>
-    <w:basedOn w:val="11"/>
+    <w:basedOn w:val="701"/>
     <w:uiPriority w:val="99"/>
     <w:pPr>
       <w:pBdr/>
@@ -16848,9 +16844,9 @@
       </w:tcPr>
     </w:tblStylePr>
   </w:style>
-  <w:style w:type="table" w:styleId="77">
+  <w:style w:type="table" w:styleId="767">
     <w:name w:val="List Table 2 - Accent 2"/>
-    <w:basedOn w:val="11"/>
+    <w:basedOn w:val="701"/>
     <w:uiPriority w:val="99"/>
     <w:pPr>
       <w:pBdr/>
@@ -17086,9 +17082,9 @@
       </w:tcPr>
     </w:tblStylePr>
   </w:style>
-  <w:style w:type="table" w:styleId="78">
+  <w:style w:type="table" w:styleId="768">
     <w:name w:val="List Table 2 - Accent 3"/>
-    <w:basedOn w:val="11"/>
+    <w:basedOn w:val="701"/>
     <w:uiPriority w:val="99"/>
     <w:pPr>
       <w:pBdr/>
@@ -17324,9 +17320,9 @@
       </w:tcPr>
     </w:tblStylePr>
   </w:style>
-  <w:style w:type="table" w:styleId="79">
+  <w:style w:type="table" w:styleId="769">
     <w:name w:val="List Table 2 - Accent 4"/>
-    <w:basedOn w:val="11"/>
+    <w:basedOn w:val="701"/>
     <w:uiPriority w:val="99"/>
     <w:pPr>
       <w:pBdr/>
@@ -17562,9 +17558,9 @@
       </w:tcPr>
     </w:tblStylePr>
   </w:style>
-  <w:style w:type="table" w:styleId="80">
+  <w:style w:type="table" w:styleId="770">
     <w:name w:val="List Table 2 - Accent 5"/>
-    <w:basedOn w:val="11"/>
+    <w:basedOn w:val="701"/>
     <w:uiPriority w:val="99"/>
     <w:pPr>
       <w:pBdr/>
@@ -17800,9 +17796,9 @@
       </w:tcPr>
     </w:tblStylePr>
   </w:style>
-  <w:style w:type="table" w:styleId="81">
+  <w:style w:type="table" w:styleId="771">
     <w:name w:val="List Table 2 - Accent 6"/>
-    <w:basedOn w:val="11"/>
+    <w:basedOn w:val="701"/>
     <w:uiPriority w:val="99"/>
     <w:pPr>
       <w:pBdr/>
@@ -18038,9 +18034,9 @@
       </w:tcPr>
     </w:tblStylePr>
   </w:style>
-  <w:style w:type="table" w:styleId="82">
+  <w:style w:type="table" w:styleId="772">
     <w:name w:val="List Table 3"/>
-    <w:basedOn w:val="11"/>
+    <w:basedOn w:val="701"/>
     <w:uiPriority w:val="99"/>
     <w:pPr>
       <w:pBdr/>
@@ -18266,9 +18262,9 @@
       </w:tcPr>
     </w:tblStylePr>
   </w:style>
-  <w:style w:type="table" w:styleId="83">
+  <w:style w:type="table" w:styleId="773">
     <w:name w:val="List Table 3 - Accent 1"/>
-    <w:basedOn w:val="11"/>
+    <w:basedOn w:val="701"/>
     <w:uiPriority w:val="99"/>
     <w:pPr>
       <w:pBdr/>
@@ -18494,9 +18490,9 @@
       </w:tcPr>
     </w:tblStylePr>
   </w:style>
-  <w:style w:type="table" w:styleId="84">
+  <w:style w:type="table" w:styleId="774">
     <w:name w:val="List Table 3 - Accent 2"/>
-    <w:basedOn w:val="11"/>
+    <w:basedOn w:val="701"/>
     <w:uiPriority w:val="99"/>
     <w:pPr>
       <w:pBdr/>
@@ -18722,9 +18718,9 @@
       </w:tcPr>
     </w:tblStylePr>
   </w:style>
-  <w:style w:type="table" w:styleId="85">
+  <w:style w:type="table" w:styleId="775">
     <w:name w:val="List Table 3 - Accent 3"/>
-    <w:basedOn w:val="11"/>
+    <w:basedOn w:val="701"/>
     <w:uiPriority w:val="99"/>
     <w:pPr>
       <w:pBdr/>
@@ -18950,9 +18946,9 @@
       </w:tcPr>
     </w:tblStylePr>
   </w:style>
-  <w:style w:type="table" w:styleId="86">
+  <w:style w:type="table" w:styleId="776">
     <w:name w:val="List Table 3 - Accent 4"/>
-    <w:basedOn w:val="11"/>
+    <w:basedOn w:val="701"/>
     <w:uiPriority w:val="99"/>
     <w:pPr>
       <w:pBdr/>
@@ -19178,9 +19174,9 @@
       </w:tcPr>
     </w:tblStylePr>
   </w:style>
-  <w:style w:type="table" w:styleId="87">
+  <w:style w:type="table" w:styleId="777">
     <w:name w:val="List Table 3 - Accent 5"/>
-    <w:basedOn w:val="11"/>
+    <w:basedOn w:val="701"/>
     <w:uiPriority w:val="99"/>
     <w:pPr>
       <w:pBdr/>
@@ -19406,9 +19402,9 @@
       </w:tcPr>
     </w:tblStylePr>
   </w:style>
-  <w:style w:type="table" w:styleId="88">
+  <w:style w:type="table" w:styleId="778">
     <w:name w:val="List Table 3 - Accent 6"/>
-    <w:basedOn w:val="11"/>
+    <w:basedOn w:val="701"/>
     <w:uiPriority w:val="99"/>
     <w:pPr>
       <w:pBdr/>
@@ -19634,9 +19630,9 @@
       </w:tcPr>
     </w:tblStylePr>
   </w:style>
-  <w:style w:type="table" w:styleId="89">
+  <w:style w:type="table" w:styleId="779">
     <w:name w:val="List Table 4"/>
-    <w:basedOn w:val="11"/>
+    <w:basedOn w:val="701"/>
     <w:uiPriority w:val="99"/>
     <w:pPr>
       <w:pBdr/>
@@ -19859,9 +19855,9 @@
       </w:tcPr>
     </w:tblStylePr>
   </w:style>
-  <w:style w:type="table" w:styleId="90">
+  <w:style w:type="table" w:styleId="780">
     <w:name w:val="List Table 4 - Accent 1"/>
-    <w:basedOn w:val="11"/>
+    <w:basedOn w:val="701"/>
     <w:uiPriority w:val="99"/>
     <w:pPr>
       <w:pBdr/>
@@ -20084,9 +20080,9 @@
       </w:tcPr>
     </w:tblStylePr>
   </w:style>
-  <w:style w:type="table" w:styleId="91">
+  <w:style w:type="table" w:styleId="781">
     <w:name w:val="List Table 4 - Accent 2"/>
-    <w:basedOn w:val="11"/>
+    <w:basedOn w:val="701"/>
     <w:uiPriority w:val="99"/>
     <w:pPr>
       <w:pBdr/>
@@ -20309,9 +20305,9 @@
       </w:tcPr>
     </w:tblStylePr>
   </w:style>
-  <w:style w:type="table" w:styleId="92">
+  <w:style w:type="table" w:styleId="782">
     <w:name w:val="List Table 4 - Accent 3"/>
-    <w:basedOn w:val="11"/>
+    <w:basedOn w:val="701"/>
     <w:uiPriority w:val="99"/>
     <w:pPr>
       <w:pBdr/>
@@ -20534,9 +20530,9 @@
       </w:tcPr>
     </w:tblStylePr>
   </w:style>
-  <w:style w:type="table" w:styleId="93">
+  <w:style w:type="table" w:styleId="783">
     <w:name w:val="List Table 4 - Accent 4"/>
-    <w:basedOn w:val="11"/>
+    <w:basedOn w:val="701"/>
     <w:uiPriority w:val="99"/>
     <w:pPr>
       <w:pBdr/>
@@ -20759,9 +20755,9 @@
       </w:tcPr>
     </w:tblStylePr>
   </w:style>
-  <w:style w:type="table" w:styleId="94">
+  <w:style w:type="table" w:styleId="784">
     <w:name w:val="List Table 4 - Accent 5"/>
-    <w:basedOn w:val="11"/>
+    <w:basedOn w:val="701"/>
     <w:uiPriority w:val="99"/>
     <w:pPr>
       <w:pBdr/>
@@ -20984,9 +20980,9 @@
       </w:tcPr>
     </w:tblStylePr>
   </w:style>
-  <w:style w:type="table" w:styleId="95">
+  <w:style w:type="table" w:styleId="785">
     <w:name w:val="List Table 4 - Accent 6"/>
-    <w:basedOn w:val="11"/>
+    <w:basedOn w:val="701"/>
     <w:uiPriority w:val="99"/>
     <w:pPr>
       <w:pBdr/>
@@ -21209,9 +21205,9 @@
       </w:tcPr>
     </w:tblStylePr>
   </w:style>
-  <w:style w:type="table" w:styleId="96">
+  <w:style w:type="table" w:styleId="786">
     <w:name w:val="List Table 5 Dark"/>
-    <w:basedOn w:val="11"/>
+    <w:basedOn w:val="701"/>
     <w:uiPriority w:val="99"/>
     <w:pPr>
       <w:pBdr/>
@@ -21451,9 +21447,9 @@
       </w:tcPr>
     </w:tblStylePr>
   </w:style>
-  <w:style w:type="table" w:styleId="97">
+  <w:style w:type="table" w:styleId="787">
     <w:name w:val="List Table 5 Dark - Accent 1"/>
-    <w:basedOn w:val="11"/>
+    <w:basedOn w:val="701"/>
     <w:uiPriority w:val="99"/>
     <w:pPr>
       <w:pBdr/>
@@ -21693,9 +21689,9 @@
       </w:tcPr>
     </w:tblStylePr>
   </w:style>
-  <w:style w:type="table" w:styleId="98">
+  <w:style w:type="table" w:styleId="788">
     <w:name w:val="List Table 5 Dark - Accent 2"/>
-    <w:basedOn w:val="11"/>
+    <w:basedOn w:val="701"/>
     <w:uiPriority w:val="99"/>
     <w:pPr>
       <w:pBdr/>
@@ -21935,9 +21931,9 @@
       </w:tcPr>
     </w:tblStylePr>
   </w:style>
-  <w:style w:type="table" w:styleId="99">
+  <w:style w:type="table" w:styleId="789">
     <w:name w:val="List Table 5 Dark - Accent 3"/>
-    <w:basedOn w:val="11"/>
+    <w:basedOn w:val="701"/>
     <w:uiPriority w:val="99"/>
     <w:pPr>
       <w:pBdr/>
@@ -22177,9 +22173,9 @@
       </w:tcPr>
     </w:tblStylePr>
   </w:style>
-  <w:style w:type="table" w:styleId="100">
+  <w:style w:type="table" w:styleId="790">
     <w:name w:val="List Table 5 Dark - Accent 4"/>
-    <w:basedOn w:val="11"/>
+    <w:basedOn w:val="701"/>
     <w:uiPriority w:val="99"/>
     <w:pPr>
       <w:pBdr/>
@@ -22419,9 +22415,9 @@
       </w:tcPr>
     </w:tblStylePr>
   </w:style>
-  <w:style w:type="table" w:styleId="101">
+  <w:style w:type="table" w:styleId="791">
     <w:name w:val="List Table 5 Dark - Accent 5"/>
-    <w:basedOn w:val="11"/>
+    <w:basedOn w:val="701"/>
     <w:uiPriority w:val="99"/>
     <w:pPr>
       <w:pBdr/>
@@ -22661,9 +22657,9 @@
       </w:tcPr>
     </w:tblStylePr>
   </w:style>
-  <w:style w:type="table" w:styleId="102">
+  <w:style w:type="table" w:styleId="792">
     <w:name w:val="List Table 5 Dark - Accent 6"/>
-    <w:basedOn w:val="11"/>
+    <w:basedOn w:val="701"/>
     <w:uiPriority w:val="99"/>
     <w:pPr>
       <w:pBdr/>
@@ -22903,9 +22899,9 @@
       </w:tcPr>
     </w:tblStylePr>
   </w:style>
-  <w:style w:type="table" w:styleId="103">
+  <w:style w:type="table" w:styleId="793">
     <w:name w:val="List Table 6 Colorful"/>
-    <w:basedOn w:val="11"/>
+    <w:basedOn w:val="701"/>
     <w:uiPriority w:val="99"/>
     <w:pPr>
       <w:pBdr/>
@@ -23126,9 +23122,9 @@
       </w:tcPr>
     </w:tblStylePr>
   </w:style>
-  <w:style w:type="table" w:styleId="104">
+  <w:style w:type="table" w:styleId="794">
     <w:name w:val="List Table 6 Colorful - Accent 1"/>
-    <w:basedOn w:val="11"/>
+    <w:basedOn w:val="701"/>
     <w:uiPriority w:val="99"/>
     <w:pPr>
       <w:pBdr/>
@@ -23349,9 +23345,9 @@
       </w:tcPr>
     </w:tblStylePr>
   </w:style>
-  <w:style w:type="table" w:styleId="105">
+  <w:style w:type="table" w:styleId="795">
     <w:name w:val="List Table 6 Colorful - Accent 2"/>
-    <w:basedOn w:val="11"/>
+    <w:basedOn w:val="701"/>
     <w:uiPriority w:val="99"/>
     <w:pPr>
       <w:pBdr/>
@@ -23572,9 +23568,9 @@
       </w:tcPr>
     </w:tblStylePr>
   </w:style>
-  <w:style w:type="table" w:styleId="106">
+  <w:style w:type="table" w:styleId="796">
     <w:name w:val="List Table 6 Colorful - Accent 3"/>
-    <w:basedOn w:val="11"/>
+    <w:basedOn w:val="701"/>
     <w:uiPriority w:val="99"/>
     <w:pPr>
       <w:pBdr/>
@@ -23795,9 +23791,9 @@
       </w:tcPr>
     </w:tblStylePr>
   </w:style>
-  <w:style w:type="table" w:styleId="107">
+  <w:style w:type="table" w:styleId="797">
     <w:name w:val="List Table 6 Colorful - Accent 4"/>
-    <w:basedOn w:val="11"/>
+    <w:basedOn w:val="701"/>
     <w:uiPriority w:val="99"/>
     <w:pPr>
       <w:pBdr/>
@@ -24018,9 +24014,9 @@
       </w:tcPr>
     </w:tblStylePr>
   </w:style>
-  <w:style w:type="table" w:styleId="108">
+  <w:style w:type="table" w:styleId="798">
     <w:name w:val="List Table 6 Colorful - Accent 5"/>
-    <w:basedOn w:val="11"/>
+    <w:basedOn w:val="701"/>
     <w:uiPriority w:val="99"/>
     <w:pPr>
       <w:pBdr/>
@@ -24241,9 +24237,9 @@
       </w:tcPr>
     </w:tblStylePr>
   </w:style>
-  <w:style w:type="table" w:styleId="109">
+  <w:style w:type="table" w:styleId="799">
     <w:name w:val="List Table 6 Colorful - Accent 6"/>
-    <w:basedOn w:val="11"/>
+    <w:basedOn w:val="701"/>
     <w:uiPriority w:val="99"/>
     <w:pPr>
       <w:pBdr/>
@@ -24464,9 +24460,9 @@
       </w:tcPr>
     </w:tblStylePr>
   </w:style>
-  <w:style w:type="table" w:styleId="110">
+  <w:style w:type="table" w:styleId="800">
     <w:name w:val="List Table 7 Colorful"/>
-    <w:basedOn w:val="11"/>
+    <w:basedOn w:val="701"/>
     <w:uiPriority w:val="99"/>
     <w:pPr>
       <w:pBdr/>
@@ -24565,11 +24561,11 @@
         <w:tblBorders/>
       </w:tblPr>
       <w:tcPr>
-        <w:shd w:color="ffffff"/>
+        <w:shd w:val="clear" w:color="ffffff"/>
         <w:tcBorders>
-          <w:top w:val="none"/>
-          <w:left w:val="none"/>
-          <w:bottom w:val="none"/>
+          <w:top w:val="none" w:color="000000" w:sz="4" w:space="0"/>
+          <w:left w:val="none" w:color="000000" w:sz="4" w:space="0"/>
+          <w:bottom w:val="none" w:color="000000" w:sz="4" w:space="0"/>
           <w:right w:val="single" w:color="000000" w:themeColor="text1" w:themeTint="80" w:sz="4" w:space="0"/>
         </w:tcBorders>
       </w:tcPr>
@@ -24592,10 +24588,10 @@
       <w:tcPr>
         <w:shd w:val="clear" w:color="ffffff" w:themeColor="light1" w:fill="ffffff" w:themeFill="light1"/>
         <w:tcBorders>
-          <w:top w:val="none"/>
-          <w:left w:val="none"/>
+          <w:top w:val="none" w:color="000000" w:sz="4" w:space="0"/>
+          <w:left w:val="none" w:color="000000" w:sz="4" w:space="0"/>
           <w:bottom w:val="single" w:color="000000" w:themeColor="text1" w:themeTint="80" w:sz="4" w:space="0"/>
-          <w:right w:val="none"/>
+          <w:right w:val="none" w:color="000000" w:sz="4" w:space="0"/>
         </w:tcBorders>
       </w:tcPr>
     </w:tblStylePr>
@@ -24615,12 +24611,12 @@
         <w:tblBorders/>
       </w:tblPr>
       <w:tcPr>
-        <w:shd w:color="ffffff"/>
+        <w:shd w:val="clear" w:color="ffffff"/>
         <w:tcBorders>
-          <w:top w:val="none"/>
+          <w:top w:val="none" w:color="000000" w:sz="4" w:space="0"/>
           <w:left w:val="single" w:color="000000" w:themeColor="text1" w:themeTint="80" w:sz="4" w:space="0"/>
-          <w:bottom w:val="none"/>
-          <w:right w:val="none"/>
+          <w:bottom w:val="none" w:color="000000" w:sz="4" w:space="0"/>
+          <w:right w:val="none" w:color="000000" w:sz="4" w:space="0"/>
         </w:tcBorders>
       </w:tcPr>
     </w:tblStylePr>
@@ -24643,9 +24639,9 @@
         <w:shd w:val="clear" w:color="ffffff" w:themeColor="light1" w:fill="ffffff" w:themeFill="light1"/>
         <w:tcBorders>
           <w:top w:val="single" w:color="000000" w:themeColor="text1" w:themeTint="80" w:sz="4" w:space="0"/>
-          <w:left w:val="none"/>
-          <w:bottom w:val="none"/>
-          <w:right w:val="none"/>
+          <w:left w:val="none" w:color="000000" w:sz="4" w:space="0"/>
+          <w:bottom w:val="none" w:color="000000" w:sz="4" w:space="0"/>
+          <w:right w:val="none" w:color="000000" w:sz="4" w:space="0"/>
         </w:tcBorders>
       </w:tcPr>
     </w:tblStylePr>
@@ -24720,9 +24716,9 @@
       </w:tcPr>
     </w:tblStylePr>
   </w:style>
-  <w:style w:type="table" w:styleId="111">
+  <w:style w:type="table" w:styleId="801">
     <w:name w:val="List Table 7 Colorful - Accent 1"/>
-    <w:basedOn w:val="11"/>
+    <w:basedOn w:val="701"/>
     <w:uiPriority w:val="99"/>
     <w:pPr>
       <w:pBdr/>
@@ -24821,11 +24817,11 @@
         <w:tblBorders/>
       </w:tblPr>
       <w:tcPr>
-        <w:shd w:color="ffffff"/>
+        <w:shd w:val="clear" w:color="ffffff"/>
         <w:tcBorders>
-          <w:top w:val="none"/>
-          <w:left w:val="none"/>
-          <w:bottom w:val="none"/>
+          <w:top w:val="none" w:color="000000" w:sz="4" w:space="0"/>
+          <w:left w:val="none" w:color="000000" w:sz="4" w:space="0"/>
+          <w:bottom w:val="none" w:color="000000" w:sz="4" w:space="0"/>
           <w:right w:val="single" w:color="000000" w:themeColor="accent1" w:sz="4" w:space="0"/>
         </w:tcBorders>
       </w:tcPr>
@@ -24848,10 +24844,10 @@
       <w:tcPr>
         <w:shd w:val="clear" w:color="ffffff" w:themeColor="light1" w:fill="ffffff" w:themeFill="light1"/>
         <w:tcBorders>
-          <w:top w:val="none"/>
-          <w:left w:val="none"/>
+          <w:top w:val="none" w:color="000000" w:sz="4" w:space="0"/>
+          <w:left w:val="none" w:color="000000" w:sz="4" w:space="0"/>
           <w:bottom w:val="single" w:color="000000" w:themeColor="accent1" w:sz="4" w:space="0"/>
-          <w:right w:val="none"/>
+          <w:right w:val="none" w:color="000000" w:sz="4" w:space="0"/>
         </w:tcBorders>
       </w:tcPr>
     </w:tblStylePr>
@@ -24871,12 +24867,12 @@
         <w:tblBorders/>
       </w:tblPr>
       <w:tcPr>
-        <w:shd w:color="ffffff"/>
+        <w:shd w:val="clear" w:color="ffffff"/>
         <w:tcBorders>
-          <w:top w:val="none"/>
+          <w:top w:val="none" w:color="000000" w:sz="4" w:space="0"/>
           <w:left w:val="single" w:color="000000" w:themeColor="accent1" w:sz="4" w:space="0"/>
-          <w:bottom w:val="none"/>
-          <w:right w:val="none"/>
+          <w:bottom w:val="none" w:color="000000" w:sz="4" w:space="0"/>
+          <w:right w:val="none" w:color="000000" w:sz="4" w:space="0"/>
         </w:tcBorders>
       </w:tcPr>
     </w:tblStylePr>
@@ -24899,9 +24895,9 @@
         <w:shd w:val="clear" w:color="ffffff" w:themeColor="light1" w:fill="ffffff" w:themeFill="light1"/>
         <w:tcBorders>
           <w:top w:val="single" w:color="000000" w:themeColor="accent1" w:sz="4" w:space="0"/>
-          <w:left w:val="none"/>
-          <w:bottom w:val="none"/>
-          <w:right w:val="none"/>
+          <w:left w:val="none" w:color="000000" w:sz="4" w:space="0"/>
+          <w:bottom w:val="none" w:color="000000" w:sz="4" w:space="0"/>
+          <w:right w:val="none" w:color="000000" w:sz="4" w:space="0"/>
         </w:tcBorders>
       </w:tcPr>
     </w:tblStylePr>
@@ -24976,9 +24972,9 @@
       </w:tcPr>
     </w:tblStylePr>
   </w:style>
-  <w:style w:type="table" w:styleId="112">
+  <w:style w:type="table" w:styleId="802">
     <w:name w:val="List Table 7 Colorful - Accent 2"/>
-    <w:basedOn w:val="11"/>
+    <w:basedOn w:val="701"/>
     <w:uiPriority w:val="99"/>
     <w:pPr>
       <w:pBdr/>
@@ -25077,11 +25073,11 @@
         <w:tblBorders/>
       </w:tblPr>
       <w:tcPr>
-        <w:shd w:color="ffffff"/>
+        <w:shd w:val="clear" w:color="ffffff"/>
         <w:tcBorders>
-          <w:top w:val="none"/>
-          <w:left w:val="none"/>
-          <w:bottom w:val="none"/>
+          <w:top w:val="none" w:color="000000" w:sz="4" w:space="0"/>
+          <w:left w:val="none" w:color="000000" w:sz="4" w:space="0"/>
+          <w:bottom w:val="none" w:color="000000" w:sz="4" w:space="0"/>
           <w:right w:val="single" w:color="000000" w:themeColor="accent2" w:themeTint="97" w:sz="4" w:space="0"/>
         </w:tcBorders>
       </w:tcPr>
@@ -25104,10 +25100,10 @@
       <w:tcPr>
         <w:shd w:val="clear" w:color="ffffff" w:themeColor="light1" w:fill="ffffff" w:themeFill="light1"/>
         <w:tcBorders>
-          <w:top w:val="none"/>
-          <w:left w:val="none"/>
+          <w:top w:val="none" w:color="000000" w:sz="4" w:space="0"/>
+          <w:left w:val="none" w:color="000000" w:sz="4" w:space="0"/>
           <w:bottom w:val="single" w:color="000000" w:themeColor="accent2" w:themeTint="97" w:sz="4" w:space="0"/>
-          <w:right w:val="none"/>
+          <w:right w:val="none" w:color="000000" w:sz="4" w:space="0"/>
         </w:tcBorders>
       </w:tcPr>
     </w:tblStylePr>
@@ -25127,12 +25123,12 @@
         <w:tblBorders/>
       </w:tblPr>
       <w:tcPr>
-        <w:shd w:color="ffffff"/>
+        <w:shd w:val="clear" w:color="ffffff"/>
         <w:tcBorders>
-          <w:top w:val="none"/>
+          <w:top w:val="none" w:color="000000" w:sz="4" w:space="0"/>
           <w:left w:val="single" w:color="000000" w:themeColor="accent2" w:themeTint="97" w:sz="4" w:space="0"/>
-          <w:bottom w:val="none"/>
-          <w:right w:val="none"/>
+          <w:bottom w:val="none" w:color="000000" w:sz="4" w:space="0"/>
+          <w:right w:val="none" w:color="000000" w:sz="4" w:space="0"/>
         </w:tcBorders>
       </w:tcPr>
     </w:tblStylePr>
@@ -25155,9 +25151,9 @@
         <w:shd w:val="clear" w:color="ffffff" w:themeColor="light1" w:fill="ffffff" w:themeFill="light1"/>
         <w:tcBorders>
           <w:top w:val="single" w:color="000000" w:themeColor="accent2" w:themeTint="97" w:sz="4" w:space="0"/>
-          <w:left w:val="none"/>
-          <w:bottom w:val="none"/>
-          <w:right w:val="none"/>
+          <w:left w:val="none" w:color="000000" w:sz="4" w:space="0"/>
+          <w:bottom w:val="none" w:color="000000" w:sz="4" w:space="0"/>
+          <w:right w:val="none" w:color="000000" w:sz="4" w:space="0"/>
         </w:tcBorders>
       </w:tcPr>
     </w:tblStylePr>
@@ -25232,9 +25228,9 @@
       </w:tcPr>
     </w:tblStylePr>
   </w:style>
-  <w:style w:type="table" w:styleId="113">
+  <w:style w:type="table" w:styleId="803">
     <w:name w:val="List Table 7 Colorful - Accent 3"/>
-    <w:basedOn w:val="11"/>
+    <w:basedOn w:val="701"/>
     <w:uiPriority w:val="99"/>
     <w:pPr>
       <w:pBdr/>
@@ -25333,11 +25329,11 @@
         <w:tblBorders/>
       </w:tblPr>
       <w:tcPr>
-        <w:shd w:color="ffffff"/>
+        <w:shd w:val="clear" w:color="ffffff"/>
         <w:tcBorders>
-          <w:top w:val="none"/>
-          <w:left w:val="none"/>
-          <w:bottom w:val="none"/>
+          <w:top w:val="none" w:color="000000" w:sz="4" w:space="0"/>
+          <w:left w:val="none" w:color="000000" w:sz="4" w:space="0"/>
+          <w:bottom w:val="none" w:color="000000" w:sz="4" w:space="0"/>
           <w:right w:val="single" w:color="000000" w:themeColor="accent3" w:themeTint="98" w:sz="4" w:space="0"/>
         </w:tcBorders>
       </w:tcPr>
@@ -25360,10 +25356,10 @@
       <w:tcPr>
         <w:shd w:val="clear" w:color="ffffff" w:themeColor="light1" w:fill="ffffff" w:themeFill="light1"/>
         <w:tcBorders>
-          <w:top w:val="none"/>
-          <w:left w:val="none"/>
+          <w:top w:val="none" w:color="000000" w:sz="4" w:space="0"/>
+          <w:left w:val="none" w:color="000000" w:sz="4" w:space="0"/>
           <w:bottom w:val="single" w:color="000000" w:themeColor="accent3" w:themeTint="98" w:sz="4" w:space="0"/>
-          <w:right w:val="none"/>
+          <w:right w:val="none" w:color="000000" w:sz="4" w:space="0"/>
         </w:tcBorders>
       </w:tcPr>
     </w:tblStylePr>
@@ -25383,12 +25379,12 @@
         <w:tblBorders/>
       </w:tblPr>
       <w:tcPr>
-        <w:shd w:color="ffffff"/>
+        <w:shd w:val="clear" w:color="ffffff"/>
         <w:tcBorders>
-          <w:top w:val="none"/>
+          <w:top w:val="none" w:color="000000" w:sz="4" w:space="0"/>
           <w:left w:val="single" w:color="000000" w:themeColor="accent3" w:themeTint="98" w:sz="4" w:space="0"/>
-          <w:bottom w:val="none"/>
-          <w:right w:val="none"/>
+          <w:bottom w:val="none" w:color="000000" w:sz="4" w:space="0"/>
+          <w:right w:val="none" w:color="000000" w:sz="4" w:space="0"/>
         </w:tcBorders>
       </w:tcPr>
     </w:tblStylePr>
@@ -25411,9 +25407,9 @@
         <w:shd w:val="clear" w:color="ffffff" w:themeColor="light1" w:fill="ffffff" w:themeFill="light1"/>
         <w:tcBorders>
           <w:top w:val="single" w:color="000000" w:themeColor="accent3" w:themeTint="98" w:sz="4" w:space="0"/>
-          <w:left w:val="none"/>
-          <w:bottom w:val="none"/>
-          <w:right w:val="none"/>
+          <w:left w:val="none" w:color="000000" w:sz="4" w:space="0"/>
+          <w:bottom w:val="none" w:color="000000" w:sz="4" w:space="0"/>
+          <w:right w:val="none" w:color="000000" w:sz="4" w:space="0"/>
         </w:tcBorders>
       </w:tcPr>
     </w:tblStylePr>
@@ -25488,9 +25484,9 @@
       </w:tcPr>
     </w:tblStylePr>
   </w:style>
-  <w:style w:type="table" w:styleId="114">
+  <w:style w:type="table" w:styleId="804">
     <w:name w:val="List Table 7 Colorful - Accent 4"/>
-    <w:basedOn w:val="11"/>
+    <w:basedOn w:val="701"/>
     <w:uiPriority w:val="99"/>
     <w:pPr>
       <w:pBdr/>
@@ -25589,11 +25585,11 @@
         <w:tblBorders/>
       </w:tblPr>
       <w:tcPr>
-        <w:shd w:color="ffffff"/>
+        <w:shd w:val="clear" w:color="ffffff"/>
         <w:tcBorders>
-          <w:top w:val="none"/>
-          <w:left w:val="none"/>
-          <w:bottom w:val="none"/>
+          <w:top w:val="none" w:color="000000" w:sz="4" w:space="0"/>
+          <w:left w:val="none" w:color="000000" w:sz="4" w:space="0"/>
+          <w:bottom w:val="none" w:color="000000" w:sz="4" w:space="0"/>
           <w:right w:val="single" w:color="000000" w:themeColor="accent4" w:themeTint="9A" w:sz="4" w:space="0"/>
         </w:tcBorders>
       </w:tcPr>
@@ -25616,10 +25612,10 @@
       <w:tcPr>
         <w:shd w:val="clear" w:color="ffffff" w:themeColor="light1" w:fill="ffffff" w:themeFill="light1"/>
         <w:tcBorders>
-          <w:top w:val="none"/>
-          <w:left w:val="none"/>
+          <w:top w:val="none" w:color="000000" w:sz="4" w:space="0"/>
+          <w:left w:val="none" w:color="000000" w:sz="4" w:space="0"/>
           <w:bottom w:val="single" w:color="000000" w:themeColor="accent4" w:themeTint="9A" w:sz="4" w:space="0"/>
-          <w:right w:val="none"/>
+          <w:right w:val="none" w:color="000000" w:sz="4" w:space="0"/>
         </w:tcBorders>
       </w:tcPr>
     </w:tblStylePr>
@@ -25639,12 +25635,12 @@
         <w:tblBorders/>
       </w:tblPr>
       <w:tcPr>
-        <w:shd w:color="ffffff"/>
+        <w:shd w:val="clear" w:color="ffffff"/>
         <w:tcBorders>
-          <w:top w:val="none"/>
+          <w:top w:val="none" w:color="000000" w:sz="4" w:space="0"/>
           <w:left w:val="single" w:color="000000" w:themeColor="accent4" w:themeTint="9A" w:sz="4" w:space="0"/>
-          <w:bottom w:val="none"/>
-          <w:right w:val="none"/>
+          <w:bottom w:val="none" w:color="000000" w:sz="4" w:space="0"/>
+          <w:right w:val="none" w:color="000000" w:sz="4" w:space="0"/>
         </w:tcBorders>
       </w:tcPr>
     </w:tblStylePr>
@@ -25667,9 +25663,9 @@
         <w:shd w:val="clear" w:color="ffffff" w:themeColor="light1" w:fill="ffffff" w:themeFill="light1"/>
         <w:tcBorders>
           <w:top w:val="single" w:color="000000" w:themeColor="accent4" w:themeTint="9A" w:sz="4" w:space="0"/>
-          <w:left w:val="none"/>
-          <w:bottom w:val="none"/>
-          <w:right w:val="none"/>
+          <w:left w:val="none" w:color="000000" w:sz="4" w:space="0"/>
+          <w:bottom w:val="none" w:color="000000" w:sz="4" w:space="0"/>
+          <w:right w:val="none" w:color="000000" w:sz="4" w:space="0"/>
         </w:tcBorders>
       </w:tcPr>
     </w:tblStylePr>
@@ -25744,9 +25740,9 @@
       </w:tcPr>
     </w:tblStylePr>
   </w:style>
-  <w:style w:type="table" w:styleId="115">
+  <w:style w:type="table" w:styleId="805">
     <w:name w:val="List Table 7 Colorful - Accent 5"/>
-    <w:basedOn w:val="11"/>
+    <w:basedOn w:val="701"/>
     <w:uiPriority w:val="99"/>
     <w:pPr>
       <w:pBdr/>
@@ -25845,11 +25841,11 @@
         <w:tblBorders/>
       </w:tblPr>
       <w:tcPr>
-        <w:shd w:color="ffffff"/>
+        <w:shd w:val="clear" w:color="ffffff"/>
         <w:tcBorders>
-          <w:top w:val="none"/>
-          <w:left w:val="none"/>
-          <w:bottom w:val="none"/>
+          <w:top w:val="none" w:color="000000" w:sz="4" w:space="0"/>
+          <w:left w:val="none" w:color="000000" w:sz="4" w:space="0"/>
+          <w:bottom w:val="none" w:color="000000" w:sz="4" w:space="0"/>
           <w:right w:val="single" w:color="000000" w:themeColor="accent5" w:themeTint="9A" w:sz="4" w:space="0"/>
         </w:tcBorders>
       </w:tcPr>
@@ -25872,10 +25868,10 @@
       <w:tcPr>
         <w:shd w:val="clear" w:color="ffffff" w:themeColor="light1" w:fill="ffffff" w:themeFill="light1"/>
         <w:tcBorders>
-          <w:top w:val="none"/>
-          <w:left w:val="none"/>
+          <w:top w:val="none" w:color="000000" w:sz="4" w:space="0"/>
+          <w:left w:val="none" w:color="000000" w:sz="4" w:space="0"/>
           <w:bottom w:val="single" w:color="000000" w:themeColor="accent5" w:themeTint="9A" w:sz="4" w:space="0"/>
-          <w:right w:val="none"/>
+          <w:right w:val="none" w:color="000000" w:sz="4" w:space="0"/>
         </w:tcBorders>
       </w:tcPr>
     </w:tblStylePr>
@@ -25895,12 +25891,12 @@
         <w:tblBorders/>
       </w:tblPr>
       <w:tcPr>
-        <w:shd w:color="ffffff"/>
+        <w:shd w:val="clear" w:color="ffffff"/>
         <w:tcBorders>
-          <w:top w:val="none"/>
+          <w:top w:val="none" w:color="000000" w:sz="4" w:space="0"/>
           <w:left w:val="single" w:color="000000" w:themeColor="accent5" w:themeTint="9A" w:sz="4" w:space="0"/>
-          <w:bottom w:val="none"/>
-          <w:right w:val="none"/>
+          <w:bottom w:val="none" w:color="000000" w:sz="4" w:space="0"/>
+          <w:right w:val="none" w:color="000000" w:sz="4" w:space="0"/>
         </w:tcBorders>
       </w:tcPr>
     </w:tblStylePr>
@@ -25923,9 +25919,9 @@
         <w:shd w:val="clear" w:color="ffffff" w:themeColor="light1" w:fill="ffffff" w:themeFill="light1"/>
         <w:tcBorders>
           <w:top w:val="single" w:color="000000" w:themeColor="accent5" w:themeTint="9A" w:sz="4" w:space="0"/>
-          <w:left w:val="none"/>
-          <w:bottom w:val="none"/>
-          <w:right w:val="none"/>
+          <w:left w:val="none" w:color="000000" w:sz="4" w:space="0"/>
+          <w:bottom w:val="none" w:color="000000" w:sz="4" w:space="0"/>
+          <w:right w:val="none" w:color="000000" w:sz="4" w:space="0"/>
         </w:tcBorders>
       </w:tcPr>
     </w:tblStylePr>
@@ -26000,9 +25996,9 @@
       </w:tcPr>
     </w:tblStylePr>
   </w:style>
-  <w:style w:type="table" w:styleId="116">
+  <w:style w:type="table" w:styleId="806">
     <w:name w:val="List Table 7 Colorful - Accent 6"/>
-    <w:basedOn w:val="11"/>
+    <w:basedOn w:val="701"/>
     <w:uiPriority w:val="99"/>
     <w:pPr>
       <w:pBdr/>
@@ -26101,11 +26097,11 @@
         <w:tblBorders/>
       </w:tblPr>
       <w:tcPr>
-        <w:shd w:color="ffffff"/>
+        <w:shd w:val="clear" w:color="ffffff"/>
         <w:tcBorders>
-          <w:top w:val="none"/>
-          <w:left w:val="none"/>
-          <w:bottom w:val="none"/>
+          <w:top w:val="none" w:color="000000" w:sz="4" w:space="0"/>
+          <w:left w:val="none" w:color="000000" w:sz="4" w:space="0"/>
+          <w:bottom w:val="none" w:color="000000" w:sz="4" w:space="0"/>
           <w:right w:val="single" w:color="000000" w:themeColor="accent6" w:themeTint="98" w:sz="4" w:space="0"/>
         </w:tcBorders>
       </w:tcPr>
@@ -26128,10 +26124,10 @@
       <w:tcPr>
         <w:shd w:val="clear" w:color="ffffff" w:themeColor="light1" w:fill="ffffff" w:themeFill="light1"/>
         <w:tcBorders>
-          <w:top w:val="none"/>
-          <w:left w:val="none"/>
+          <w:top w:val="none" w:color="000000" w:sz="4" w:space="0"/>
+          <w:left w:val="none" w:color="000000" w:sz="4" w:space="0"/>
           <w:bottom w:val="single" w:color="000000" w:themeColor="accent6" w:themeTint="98" w:sz="4" w:space="0"/>
-          <w:right w:val="none"/>
+          <w:right w:val="none" w:color="000000" w:sz="4" w:space="0"/>
         </w:tcBorders>
       </w:tcPr>
     </w:tblStylePr>
@@ -26151,12 +26147,12 @@
         <w:tblBorders/>
       </w:tblPr>
       <w:tcPr>
-        <w:shd w:color="ffffff"/>
+        <w:shd w:val="clear" w:color="ffffff"/>
         <w:tcBorders>
-          <w:top w:val="none"/>
+          <w:top w:val="none" w:color="000000" w:sz="4" w:space="0"/>
           <w:left w:val="single" w:color="000000" w:themeColor="accent6" w:themeTint="98" w:sz="4" w:space="0"/>
-          <w:bottom w:val="none"/>
-          <w:right w:val="none"/>
+          <w:bottom w:val="none" w:color="000000" w:sz="4" w:space="0"/>
+          <w:right w:val="none" w:color="000000" w:sz="4" w:space="0"/>
         </w:tcBorders>
       </w:tcPr>
     </w:tblStylePr>
@@ -26179,9 +26175,9 @@
         <w:shd w:val="clear" w:color="ffffff" w:themeColor="light1" w:fill="ffffff" w:themeFill="light1"/>
         <w:tcBorders>
           <w:top w:val="single" w:color="000000" w:themeColor="accent6" w:themeTint="98" w:sz="4" w:space="0"/>
-          <w:left w:val="none"/>
-          <w:bottom w:val="none"/>
-          <w:right w:val="none"/>
+          <w:left w:val="none" w:color="000000" w:sz="4" w:space="0"/>
+          <w:bottom w:val="none" w:color="000000" w:sz="4" w:space="0"/>
+          <w:right w:val="none" w:color="000000" w:sz="4" w:space="0"/>
         </w:tcBorders>
       </w:tcPr>
     </w:tblStylePr>
@@ -26256,9 +26252,9 @@
       </w:tcPr>
     </w:tblStylePr>
   </w:style>
-  <w:style w:type="table" w:styleId="117">
+  <w:style w:type="table" w:styleId="807">
     <w:name w:val="Lined - Accent"/>
-    <w:basedOn w:val="11"/>
+    <w:basedOn w:val="701"/>
     <w:uiPriority w:val="99"/>
     <w:pPr>
       <w:pBdr/>
@@ -26493,9 +26489,9 @@
       </w:tcPr>
     </w:tblStylePr>
   </w:style>
-  <w:style w:type="table" w:styleId="118">
+  <w:style w:type="table" w:styleId="808">
     <w:name w:val="Lined - Accent 1"/>
-    <w:basedOn w:val="11"/>
+    <w:basedOn w:val="701"/>
     <w:uiPriority w:val="99"/>
     <w:pPr>
       <w:pBdr/>
@@ -26730,9 +26726,9 @@
       </w:tcPr>
     </w:tblStylePr>
   </w:style>
-  <w:style w:type="table" w:styleId="119">
+  <w:style w:type="table" w:styleId="809">
     <w:name w:val="Lined - Accent 2"/>
-    <w:basedOn w:val="11"/>
+    <w:basedOn w:val="701"/>
     <w:uiPriority w:val="99"/>
     <w:pPr>
       <w:pBdr/>
@@ -26967,9 +26963,9 @@
       </w:tcPr>
     </w:tblStylePr>
   </w:style>
-  <w:style w:type="table" w:styleId="120">
+  <w:style w:type="table" w:styleId="810">
     <w:name w:val="Lined - Accent 3"/>
-    <w:basedOn w:val="11"/>
+    <w:basedOn w:val="701"/>
     <w:uiPriority w:val="99"/>
     <w:pPr>
       <w:pBdr/>
@@ -27204,9 +27200,9 @@
       </w:tcPr>
     </w:tblStylePr>
   </w:style>
-  <w:style w:type="table" w:styleId="121">
+  <w:style w:type="table" w:styleId="811">
     <w:name w:val="Lined - Accent 4"/>
-    <w:basedOn w:val="11"/>
+    <w:basedOn w:val="701"/>
     <w:uiPriority w:val="99"/>
     <w:pPr>
       <w:pBdr/>
@@ -27441,9 +27437,9 @@
       </w:tcPr>
     </w:tblStylePr>
   </w:style>
-  <w:style w:type="table" w:styleId="122">
+  <w:style w:type="table" w:styleId="812">
     <w:name w:val="Lined - Accent 5"/>
-    <w:basedOn w:val="11"/>
+    <w:basedOn w:val="701"/>
     <w:uiPriority w:val="99"/>
     <w:pPr>
       <w:pBdr/>
@@ -27678,9 +27674,9 @@
       </w:tcPr>
     </w:tblStylePr>
   </w:style>
-  <w:style w:type="table" w:styleId="123">
+  <w:style w:type="table" w:styleId="813">
     <w:name w:val="Lined - Accent 6"/>
-    <w:basedOn w:val="11"/>
+    <w:basedOn w:val="701"/>
     <w:uiPriority w:val="99"/>
     <w:pPr>
       <w:pBdr/>
@@ -27915,9 +27911,9 @@
       </w:tcPr>
     </w:tblStylePr>
   </w:style>
-  <w:style w:type="table" w:styleId="124">
+  <w:style w:type="table" w:styleId="814">
     <w:name w:val="Bordered &amp; Lined - Accent"/>
-    <w:basedOn w:val="11"/>
+    <w:basedOn w:val="701"/>
     <w:uiPriority w:val="99"/>
     <w:pPr>
       <w:pBdr/>
@@ -28159,9 +28155,9 @@
       </w:tcPr>
     </w:tblStylePr>
   </w:style>
-  <w:style w:type="table" w:styleId="125">
+  <w:style w:type="table" w:styleId="815">
     <w:name w:val="Bordered &amp; Lined - Accent 1"/>
-    <w:basedOn w:val="11"/>
+    <w:basedOn w:val="701"/>
     <w:uiPriority w:val="99"/>
     <w:pPr>
       <w:pBdr/>
@@ -28403,9 +28399,9 @@
       </w:tcPr>
     </w:tblStylePr>
   </w:style>
-  <w:style w:type="table" w:styleId="126">
+  <w:style w:type="table" w:styleId="816">
     <w:name w:val="Bordered &amp; Lined - Accent 2"/>
-    <w:basedOn w:val="11"/>
+    <w:basedOn w:val="701"/>
     <w:uiPriority w:val="99"/>
     <w:pPr>
       <w:pBdr/>
@@ -28647,9 +28643,9 @@
       </w:tcPr>
     </w:tblStylePr>
   </w:style>
-  <w:style w:type="table" w:styleId="127">
+  <w:style w:type="table" w:styleId="817">
     <w:name w:val="Bordered &amp; Lined - Accent 3"/>
-    <w:basedOn w:val="11"/>
+    <w:basedOn w:val="701"/>
     <w:uiPriority w:val="99"/>
     <w:pPr>
       <w:pBdr/>
@@ -28891,9 +28887,9 @@
       </w:tcPr>
     </w:tblStylePr>
   </w:style>
-  <w:style w:type="table" w:styleId="128">
+  <w:style w:type="table" w:styleId="818">
     <w:name w:val="Bordered &amp; Lined - Accent 4"/>
-    <w:basedOn w:val="11"/>
+    <w:basedOn w:val="701"/>
     <w:uiPriority w:val="99"/>
     <w:pPr>
       <w:pBdr/>
@@ -29135,9 +29131,9 @@
       </w:tcPr>
     </w:tblStylePr>
   </w:style>
-  <w:style w:type="table" w:styleId="129">
+  <w:style w:type="table" w:styleId="819">
     <w:name w:val="Bordered &amp; Lined - Accent 5"/>
-    <w:basedOn w:val="11"/>
+    <w:basedOn w:val="701"/>
     <w:uiPriority w:val="99"/>
     <w:pPr>
       <w:pBdr/>
@@ -29379,9 +29375,9 @@
       </w:tcPr>
     </w:tblStylePr>
   </w:style>
-  <w:style w:type="table" w:styleId="130">
+  <w:style w:type="table" w:styleId="820">
     <w:name w:val="Bordered &amp; Lined - Accent 6"/>
-    <w:basedOn w:val="11"/>
+    <w:basedOn w:val="701"/>
     <w:uiPriority w:val="99"/>
     <w:pPr>
       <w:pBdr/>
@@ -29623,9 +29619,9 @@
       </w:tcPr>
     </w:tblStylePr>
   </w:style>
-  <w:style w:type="table" w:styleId="131">
+  <w:style w:type="table" w:styleId="821">
     <w:name w:val="Bordered"/>
-    <w:basedOn w:val="11"/>
+    <w:basedOn w:val="701"/>
     <w:uiPriority w:val="99"/>
     <w:pPr>
       <w:pBdr/>
@@ -29854,9 +29850,9 @@
       </w:tcPr>
     </w:tblStylePr>
   </w:style>
-  <w:style w:type="table" w:styleId="132">
+  <w:style w:type="table" w:styleId="822">
     <w:name w:val="Bordered - Accent 1"/>
-    <w:basedOn w:val="11"/>
+    <w:basedOn w:val="701"/>
     <w:uiPriority w:val="99"/>
     <w:pPr>
       <w:pBdr/>
@@ -30085,9 +30081,9 @@
       </w:tcPr>
     </w:tblStylePr>
   </w:style>
-  <w:style w:type="table" w:styleId="133">
+  <w:style w:type="table" w:styleId="823">
     <w:name w:val="Bordered - Accent 2"/>
-    <w:basedOn w:val="11"/>
+    <w:basedOn w:val="701"/>
     <w:uiPriority w:val="99"/>
     <w:pPr>
       <w:pBdr/>
@@ -30316,9 +30312,9 @@
       </w:tcPr>
     </w:tblStylePr>
   </w:style>
-  <w:style w:type="table" w:styleId="134">
+  <w:style w:type="table" w:styleId="824">
     <w:name w:val="Bordered - Accent 3"/>
-    <w:basedOn w:val="11"/>
+    <w:basedOn w:val="701"/>
     <w:uiPriority w:val="99"/>
     <w:pPr>
       <w:pBdr/>
@@ -30547,9 +30543,9 @@
       </w:tcPr>
     </w:tblStylePr>
   </w:style>
-  <w:style w:type="table" w:styleId="135">
+  <w:style w:type="table" w:styleId="825">
     <w:name w:val="Bordered - Accent 4"/>
-    <w:basedOn w:val="11"/>
+    <w:basedOn w:val="701"/>
     <w:uiPriority w:val="99"/>
     <w:pPr>
       <w:pBdr/>
@@ -30778,9 +30774,9 @@
       </w:tcPr>
     </w:tblStylePr>
   </w:style>
-  <w:style w:type="table" w:styleId="136">
+  <w:style w:type="table" w:styleId="826">
     <w:name w:val="Bordered - Accent 5"/>
-    <w:basedOn w:val="11"/>
+    <w:basedOn w:val="701"/>
     <w:uiPriority w:val="99"/>
     <w:pPr>
       <w:pBdr/>
@@ -31009,9 +31005,9 @@
       </w:tcPr>
     </w:tblStylePr>
   </w:style>
-  <w:style w:type="table" w:styleId="137">
+  <w:style w:type="table" w:styleId="827">
     <w:name w:val="Bordered - Accent 6"/>
-    <w:basedOn w:val="11"/>
+    <w:basedOn w:val="701"/>
     <w:uiPriority w:val="99"/>
     <w:pPr>
       <w:pBdr/>
@@ -31240,7 +31236,7 @@
       </w:tcPr>
     </w:tblStylePr>
   </w:style>
-  <w:style w:type="paragraph" w:styleId="138" w:default="1">
+  <w:style w:type="paragraph" w:styleId="828" w:default="1">
     <w:name w:val="Normal"/>
     <w:qFormat/>
     <w:pPr>
@@ -31249,11 +31245,11 @@
       <w:ind/>
     </w:pPr>
   </w:style>
-  <w:style w:type="paragraph" w:styleId="139">
+  <w:style w:type="paragraph" w:styleId="829">
     <w:name w:val="Heading 1"/>
-    <w:basedOn w:val="138"/>
-    <w:next w:val="138"/>
-    <w:link w:val="150"/>
+    <w:basedOn w:val="828"/>
+    <w:next w:val="828"/>
+    <w:link w:val="840"/>
     <w:uiPriority w:val="9"/>
     <w:qFormat/>
     <w:pPr>
@@ -31271,11 +31267,11 @@
       <w:szCs w:val="40"/>
     </w:rPr>
   </w:style>
-  <w:style w:type="paragraph" w:styleId="140">
+  <w:style w:type="paragraph" w:styleId="830">
     <w:name w:val="Heading 2"/>
-    <w:basedOn w:val="138"/>
-    <w:next w:val="138"/>
-    <w:link w:val="151"/>
+    <w:basedOn w:val="828"/>
+    <w:next w:val="828"/>
+    <w:link w:val="841"/>
     <w:uiPriority w:val="9"/>
     <w:unhideWhenUsed/>
     <w:qFormat/>
@@ -31294,11 +31290,11 @@
       <w:szCs w:val="32"/>
     </w:rPr>
   </w:style>
-  <w:style w:type="paragraph" w:styleId="141">
+  <w:style w:type="paragraph" w:styleId="831">
     <w:name w:val="Heading 3"/>
-    <w:basedOn w:val="138"/>
-    <w:next w:val="138"/>
-    <w:link w:val="152"/>
+    <w:basedOn w:val="828"/>
+    <w:next w:val="828"/>
+    <w:link w:val="842"/>
     <w:uiPriority w:val="9"/>
     <w:unhideWhenUsed/>
     <w:qFormat/>
@@ -31317,11 +31313,11 @@
       <w:szCs w:val="28"/>
     </w:rPr>
   </w:style>
-  <w:style w:type="paragraph" w:styleId="142">
+  <w:style w:type="paragraph" w:styleId="832">
     <w:name w:val="Heading 4"/>
-    <w:basedOn w:val="138"/>
-    <w:next w:val="138"/>
-    <w:link w:val="153"/>
+    <w:basedOn w:val="828"/>
+    <w:next w:val="828"/>
+    <w:link w:val="843"/>
     <w:uiPriority w:val="9"/>
     <w:unhideWhenUsed/>
     <w:qFormat/>
@@ -31340,11 +31336,11 @@
       <w:color w:val="0f4761" w:themeColor="accent1" w:themeShade="BF"/>
     </w:rPr>
   </w:style>
-  <w:style w:type="paragraph" w:styleId="143">
+  <w:style w:type="paragraph" w:styleId="833">
     <w:name w:val="Heading 5"/>
-    <w:basedOn w:val="138"/>
-    <w:next w:val="138"/>
-    <w:link w:val="154"/>
+    <w:basedOn w:val="828"/>
+    <w:next w:val="828"/>
+    <w:link w:val="844"/>
     <w:uiPriority w:val="9"/>
     <w:unhideWhenUsed/>
     <w:qFormat/>
@@ -31361,11 +31357,11 @@
       <w:color w:val="0f4761" w:themeColor="accent1" w:themeShade="BF"/>
     </w:rPr>
   </w:style>
-  <w:style w:type="paragraph" w:styleId="144">
+  <w:style w:type="paragraph" w:styleId="834">
     <w:name w:val="Heading 6"/>
-    <w:basedOn w:val="138"/>
-    <w:next w:val="138"/>
-    <w:link w:val="155"/>
+    <w:basedOn w:val="828"/>
+    <w:next w:val="828"/>
+    <w:link w:val="845"/>
     <w:uiPriority w:val="9"/>
     <w:unhideWhenUsed/>
     <w:qFormat/>
@@ -31384,11 +31380,11 @@
       <w:color w:val="595959" w:themeColor="text1" w:themeTint="A6"/>
     </w:rPr>
   </w:style>
-  <w:style w:type="paragraph" w:styleId="145">
+  <w:style w:type="paragraph" w:styleId="835">
     <w:name w:val="Heading 7"/>
-    <w:basedOn w:val="138"/>
-    <w:next w:val="138"/>
-    <w:link w:val="156"/>
+    <w:basedOn w:val="828"/>
+    <w:next w:val="828"/>
+    <w:link w:val="846"/>
     <w:uiPriority w:val="9"/>
     <w:unhideWhenUsed/>
     <w:qFormat/>
@@ -31405,11 +31401,11 @@
       <w:color w:val="595959" w:themeColor="text1" w:themeTint="A6"/>
     </w:rPr>
   </w:style>
-  <w:style w:type="paragraph" w:styleId="146">
+  <w:style w:type="paragraph" w:styleId="836">
     <w:name w:val="Heading 8"/>
-    <w:basedOn w:val="138"/>
-    <w:next w:val="138"/>
-    <w:link w:val="157"/>
+    <w:basedOn w:val="828"/>
+    <w:next w:val="828"/>
+    <w:link w:val="847"/>
     <w:uiPriority w:val="9"/>
     <w:unhideWhenUsed/>
     <w:qFormat/>
@@ -31428,11 +31424,11 @@
       <w:color w:val="272727" w:themeColor="text1" w:themeTint="D8"/>
     </w:rPr>
   </w:style>
-  <w:style w:type="paragraph" w:styleId="147">
+  <w:style w:type="paragraph" w:styleId="837">
     <w:name w:val="Heading 9"/>
-    <w:basedOn w:val="138"/>
-    <w:next w:val="138"/>
-    <w:link w:val="158"/>
+    <w:basedOn w:val="828"/>
+    <w:next w:val="828"/>
+    <w:link w:val="848"/>
     <w:uiPriority w:val="9"/>
     <w:unhideWhenUsed/>
     <w:qFormat/>
@@ -31451,7 +31447,7 @@
       <w:color w:val="272727" w:themeColor="text1" w:themeTint="D8"/>
     </w:rPr>
   </w:style>
-  <w:style w:type="character" w:styleId="148" w:default="1">
+  <w:style w:type="character" w:styleId="838" w:default="1">
     <w:name w:val="Default Paragraph Font"/>
     <w:uiPriority w:val="1"/>
     <w:semiHidden/>
@@ -31462,7 +31458,7 @@
       <w:ind/>
     </w:pPr>
   </w:style>
-  <w:style w:type="numbering" w:styleId="149" w:default="1">
+  <w:style w:type="numbering" w:styleId="839" w:default="1">
     <w:name w:val="No List"/>
     <w:uiPriority w:val="99"/>
     <w:semiHidden/>
@@ -31473,10 +31469,10 @@
       <w:ind/>
     </w:pPr>
   </w:style>
-  <w:style w:type="character" w:styleId="150">
+  <w:style w:type="character" w:styleId="840">
     <w:name w:val="Heading 1 Char"/>
-    <w:basedOn w:val="148"/>
-    <w:link w:val="139"/>
+    <w:basedOn w:val="838"/>
+    <w:link w:val="829"/>
     <w:uiPriority w:val="9"/>
     <w:pPr>
       <w:pBdr/>
@@ -31490,10 +31486,10 @@
       <w:szCs w:val="40"/>
     </w:rPr>
   </w:style>
-  <w:style w:type="character" w:styleId="151">
+  <w:style w:type="character" w:styleId="841">
     <w:name w:val="Heading 2 Char"/>
-    <w:basedOn w:val="148"/>
-    <w:link w:val="140"/>
+    <w:basedOn w:val="838"/>
+    <w:link w:val="830"/>
     <w:uiPriority w:val="9"/>
     <w:pPr>
       <w:pBdr/>
@@ -31507,10 +31503,10 @@
       <w:szCs w:val="32"/>
     </w:rPr>
   </w:style>
-  <w:style w:type="character" w:styleId="152">
+  <w:style w:type="character" w:styleId="842">
     <w:name w:val="Heading 3 Char"/>
-    <w:basedOn w:val="148"/>
-    <w:link w:val="141"/>
+    <w:basedOn w:val="838"/>
+    <w:link w:val="831"/>
     <w:uiPriority w:val="9"/>
     <w:pPr>
       <w:pBdr/>
@@ -31524,10 +31520,10 @@
       <w:szCs w:val="28"/>
     </w:rPr>
   </w:style>
-  <w:style w:type="character" w:styleId="153">
+  <w:style w:type="character" w:styleId="843">
     <w:name w:val="Heading 4 Char"/>
-    <w:basedOn w:val="148"/>
-    <w:link w:val="142"/>
+    <w:basedOn w:val="838"/>
+    <w:link w:val="832"/>
     <w:uiPriority w:val="9"/>
     <w:pPr>
       <w:pBdr/>
@@ -31541,10 +31537,10 @@
       <w:color w:val="0f4761" w:themeColor="accent1" w:themeShade="BF"/>
     </w:rPr>
   </w:style>
-  <w:style w:type="character" w:styleId="154">
+  <w:style w:type="character" w:styleId="844">
     <w:name w:val="Heading 5 Char"/>
-    <w:basedOn w:val="148"/>
-    <w:link w:val="143"/>
+    <w:basedOn w:val="838"/>
+    <w:link w:val="833"/>
     <w:uiPriority w:val="9"/>
     <w:pPr>
       <w:pBdr/>
@@ -31556,10 +31552,10 @@
       <w:color w:val="0f4761" w:themeColor="accent1" w:themeShade="BF"/>
     </w:rPr>
   </w:style>
-  <w:style w:type="character" w:styleId="155">
+  <w:style w:type="character" w:styleId="845">
     <w:name w:val="Heading 6 Char"/>
-    <w:basedOn w:val="148"/>
-    <w:link w:val="144"/>
+    <w:basedOn w:val="838"/>
+    <w:link w:val="834"/>
     <w:uiPriority w:val="9"/>
     <w:pPr>
       <w:pBdr/>
@@ -31573,10 +31569,10 @@
       <w:color w:val="595959" w:themeColor="text1" w:themeTint="A6"/>
     </w:rPr>
   </w:style>
-  <w:style w:type="character" w:styleId="156">
+  <w:style w:type="character" w:styleId="846">
     <w:name w:val="Heading 7 Char"/>
-    <w:basedOn w:val="148"/>
-    <w:link w:val="145"/>
+    <w:basedOn w:val="838"/>
+    <w:link w:val="835"/>
     <w:uiPriority w:val="9"/>
     <w:pPr>
       <w:pBdr/>
@@ -31588,10 +31584,10 @@
       <w:color w:val="595959" w:themeColor="text1" w:themeTint="A6"/>
     </w:rPr>
   </w:style>
-  <w:style w:type="character" w:styleId="157">
+  <w:style w:type="character" w:styleId="847">
     <w:name w:val="Heading 8 Char"/>
-    <w:basedOn w:val="148"/>
-    <w:link w:val="146"/>
+    <w:basedOn w:val="838"/>
+    <w:link w:val="836"/>
     <w:uiPriority w:val="9"/>
     <w:pPr>
       <w:pBdr/>
@@ -31605,10 +31601,10 @@
       <w:color w:val="272727" w:themeColor="text1" w:themeTint="D8"/>
     </w:rPr>
   </w:style>
-  <w:style w:type="character" w:styleId="158">
+  <w:style w:type="character" w:styleId="848">
     <w:name w:val="Heading 9 Char"/>
-    <w:basedOn w:val="148"/>
-    <w:link w:val="147"/>
+    <w:basedOn w:val="838"/>
+    <w:link w:val="837"/>
     <w:uiPriority w:val="9"/>
     <w:pPr>
       <w:pBdr/>
@@ -31622,11 +31618,11 @@
       <w:color w:val="272727" w:themeColor="text1" w:themeTint="D8"/>
     </w:rPr>
   </w:style>
-  <w:style w:type="paragraph" w:styleId="159">
+  <w:style w:type="paragraph" w:styleId="849">
     <w:name w:val="Title"/>
-    <w:basedOn w:val="138"/>
-    <w:next w:val="138"/>
-    <w:link w:val="160"/>
+    <w:basedOn w:val="828"/>
+    <w:next w:val="828"/>
+    <w:link w:val="850"/>
     <w:uiPriority w:val="10"/>
     <w:qFormat/>
     <w:pPr>
@@ -31642,10 +31638,10 @@
       <w:szCs w:val="56"/>
     </w:rPr>
   </w:style>
-  <w:style w:type="character" w:styleId="160">
+  <w:style w:type="character" w:styleId="850">
     <w:name w:val="Title Char"/>
-    <w:basedOn w:val="148"/>
-    <w:link w:val="159"/>
+    <w:basedOn w:val="838"/>
+    <w:link w:val="849"/>
     <w:uiPriority w:val="10"/>
     <w:pPr>
       <w:pBdr/>
@@ -31659,11 +31655,11 @@
       <w:szCs w:val="56"/>
     </w:rPr>
   </w:style>
-  <w:style w:type="paragraph" w:styleId="161">
+  <w:style w:type="paragraph" w:styleId="851">
     <w:name w:val="Subtitle"/>
-    <w:basedOn w:val="138"/>
-    <w:next w:val="138"/>
-    <w:link w:val="162"/>
+    <w:basedOn w:val="828"/>
+    <w:next w:val="828"/>
+    <w:link w:val="852"/>
     <w:uiPriority w:val="11"/>
     <w:qFormat/>
     <w:pPr>
@@ -31681,10 +31677,10 @@
       <w:szCs w:val="28"/>
     </w:rPr>
   </w:style>
-  <w:style w:type="character" w:styleId="162">
+  <w:style w:type="character" w:styleId="852">
     <w:name w:val="Subtitle Char"/>
-    <w:basedOn w:val="148"/>
-    <w:link w:val="161"/>
+    <w:basedOn w:val="838"/>
+    <w:link w:val="851"/>
     <w:uiPriority w:val="11"/>
     <w:pPr>
       <w:pBdr/>
@@ -31698,11 +31694,11 @@
       <w:szCs w:val="28"/>
     </w:rPr>
   </w:style>
-  <w:style w:type="paragraph" w:styleId="163">
+  <w:style w:type="paragraph" w:styleId="853">
     <w:name w:val="Quote"/>
-    <w:basedOn w:val="138"/>
-    <w:next w:val="138"/>
-    <w:link w:val="164"/>
+    <w:basedOn w:val="828"/>
+    <w:next w:val="828"/>
+    <w:link w:val="854"/>
     <w:uiPriority w:val="29"/>
     <w:qFormat/>
     <w:pPr>
@@ -31717,10 +31713,10 @@
       <w:color w:val="404040" w:themeColor="text1" w:themeTint="BF"/>
     </w:rPr>
   </w:style>
-  <w:style w:type="character" w:styleId="164">
+  <w:style w:type="character" w:styleId="854">
     <w:name w:val="Quote Char"/>
-    <w:basedOn w:val="148"/>
-    <w:link w:val="163"/>
+    <w:basedOn w:val="838"/>
+    <w:link w:val="853"/>
     <w:uiPriority w:val="29"/>
     <w:pPr>
       <w:pBdr/>
@@ -31733,9 +31729,9 @@
       <w:color w:val="404040" w:themeColor="text1" w:themeTint="BF"/>
     </w:rPr>
   </w:style>
-  <w:style w:type="paragraph" w:styleId="165">
+  <w:style w:type="paragraph" w:styleId="855">
     <w:name w:val="List Paragraph"/>
-    <w:basedOn w:val="138"/>
+    <w:basedOn w:val="828"/>
     <w:uiPriority w:val="34"/>
     <w:qFormat/>
     <w:pPr>
@@ -31745,9 +31741,9 @@
       <w:contextualSpacing w:val="true"/>
     </w:pPr>
   </w:style>
-  <w:style w:type="character" w:styleId="166">
+  <w:style w:type="character" w:styleId="856">
     <w:name w:val="Intense Emphasis"/>
-    <w:basedOn w:val="148"/>
+    <w:basedOn w:val="838"/>
     <w:uiPriority w:val="21"/>
     <w:qFormat/>
     <w:pPr>
@@ -31761,11 +31757,11 @@
       <w:color w:val="0f4761" w:themeColor="accent1" w:themeShade="BF"/>
     </w:rPr>
   </w:style>
-  <w:style w:type="paragraph" w:styleId="167">
+  <w:style w:type="paragraph" w:styleId="857">
     <w:name w:val="Intense Quote"/>
-    <w:basedOn w:val="138"/>
-    <w:next w:val="138"/>
-    <w:link w:val="168"/>
+    <w:basedOn w:val="828"/>
+    <w:next w:val="828"/>
+    <w:link w:val="858"/>
     <w:uiPriority w:val="30"/>
     <w:qFormat/>
     <w:pPr>
@@ -31783,10 +31779,10 @@
       <w:color w:val="0f4761" w:themeColor="accent1" w:themeShade="BF"/>
     </w:rPr>
   </w:style>
-  <w:style w:type="character" w:styleId="168">
+  <w:style w:type="character" w:styleId="858">
     <w:name w:val="Intense Quote Char"/>
-    <w:basedOn w:val="148"/>
-    <w:link w:val="167"/>
+    <w:basedOn w:val="838"/>
+    <w:link w:val="857"/>
     <w:uiPriority w:val="30"/>
     <w:pPr>
       <w:pBdr/>
@@ -31799,9 +31795,9 @@
       <w:color w:val="0f4761" w:themeColor="accent1" w:themeShade="BF"/>
     </w:rPr>
   </w:style>
-  <w:style w:type="character" w:styleId="169">
+  <w:style w:type="character" w:styleId="859">
     <w:name w:val="Intense Reference"/>
-    <w:basedOn w:val="148"/>
+    <w:basedOn w:val="838"/>
     <w:uiPriority w:val="32"/>
     <w:qFormat/>
     <w:pPr>
@@ -31817,9 +31813,9 @@
       <w:spacing w:val="5"/>
     </w:rPr>
   </w:style>
-  <w:style w:type="paragraph" w:styleId="170">
+  <w:style w:type="paragraph" w:styleId="860">
     <w:name w:val="No Spacing"/>
-    <w:basedOn w:val="138"/>
+    <w:basedOn w:val="828"/>
     <w:uiPriority w:val="1"/>
     <w:qFormat/>
     <w:pPr>
@@ -31828,9 +31824,9 @@
       <w:ind/>
     </w:pPr>
   </w:style>
-  <w:style w:type="character" w:styleId="171">
+  <w:style w:type="character" w:styleId="861">
     <w:name w:val="Subtle Emphasis"/>
-    <w:basedOn w:val="148"/>
+    <w:basedOn w:val="838"/>
     <w:uiPriority w:val="19"/>
     <w:qFormat/>
     <w:pPr>
@@ -31844,9 +31840,9 @@
       <w:color w:val="404040" w:themeColor="text1" w:themeTint="BF"/>
     </w:rPr>
   </w:style>
-  <w:style w:type="character" w:styleId="172">
+  <w:style w:type="character" w:styleId="862">
     <w:name w:val="Emphasis"/>
-    <w:basedOn w:val="148"/>
+    <w:basedOn w:val="838"/>
     <w:uiPriority w:val="20"/>
     <w:qFormat/>
     <w:pPr>
@@ -31859,9 +31855,9 @@
       <w:iCs/>
     </w:rPr>
   </w:style>
-  <w:style w:type="character" w:styleId="173">
+  <w:style w:type="character" w:styleId="863">
     <w:name w:val="Strong"/>
-    <w:basedOn w:val="148"/>
+    <w:basedOn w:val="838"/>
     <w:uiPriority w:val="22"/>
     <w:qFormat/>
     <w:pPr>
@@ -31874,9 +31870,9 @@
       <w:bCs/>
     </w:rPr>
   </w:style>
-  <w:style w:type="character" w:styleId="174">
+  <w:style w:type="character" w:styleId="864">
     <w:name w:val="Subtle Reference"/>
-    <w:basedOn w:val="148"/>
+    <w:basedOn w:val="838"/>
     <w:uiPriority w:val="31"/>
     <w:qFormat/>
     <w:pPr>
@@ -31889,9 +31885,9 @@
       <w:color w:val="5a5a5a" w:themeColor="text1" w:themeTint="A5"/>
     </w:rPr>
   </w:style>
-  <w:style w:type="character" w:styleId="175">
+  <w:style w:type="character" w:styleId="865">
     <w:name w:val="Book Title"/>
-    <w:basedOn w:val="148"/>
+    <w:basedOn w:val="838"/>
     <w:uiPriority w:val="33"/>
     <w:qFormat/>
     <w:pPr>
@@ -31907,10 +31903,10 @@
       <w:spacing w:val="5"/>
     </w:rPr>
   </w:style>
-  <w:style w:type="paragraph" w:styleId="176">
+  <w:style w:type="paragraph" w:styleId="866">
     <w:name w:val="Header"/>
-    <w:basedOn w:val="138"/>
-    <w:link w:val="177"/>
+    <w:basedOn w:val="828"/>
+    <w:link w:val="867"/>
     <w:uiPriority w:val="99"/>
     <w:unhideWhenUsed/>
     <w:pPr>
@@ -31923,10 +31919,10 @@
       <w:ind/>
     </w:pPr>
   </w:style>
-  <w:style w:type="character" w:styleId="177">
+  <w:style w:type="character" w:styleId="867">
     <w:name w:val="Header Char"/>
-    <w:basedOn w:val="148"/>
-    <w:link w:val="176"/>
+    <w:basedOn w:val="838"/>
+    <w:link w:val="866"/>
     <w:uiPriority w:val="99"/>
     <w:pPr>
       <w:pBdr/>
@@ -31934,10 +31930,10 @@
       <w:ind/>
     </w:pPr>
   </w:style>
-  <w:style w:type="paragraph" w:styleId="178">
+  <w:style w:type="paragraph" w:styleId="868">
     <w:name w:val="Footer"/>
-    <w:basedOn w:val="138"/>
-    <w:link w:val="179"/>
+    <w:basedOn w:val="828"/>
+    <w:link w:val="869"/>
     <w:uiPriority w:val="99"/>
     <w:unhideWhenUsed/>
     <w:pPr>
@@ -31950,10 +31946,10 @@
       <w:ind/>
     </w:pPr>
   </w:style>
-  <w:style w:type="character" w:styleId="179">
+  <w:style w:type="character" w:styleId="869">
     <w:name w:val="Footer Char"/>
-    <w:basedOn w:val="148"/>
-    <w:link w:val="178"/>
+    <w:basedOn w:val="838"/>
+    <w:link w:val="868"/>
     <w:uiPriority w:val="99"/>
     <w:pPr>
       <w:pBdr/>
@@ -31961,10 +31957,10 @@
       <w:ind/>
     </w:pPr>
   </w:style>
-  <w:style w:type="paragraph" w:styleId="180">
+  <w:style w:type="paragraph" w:styleId="870">
     <w:name w:val="Caption"/>
-    <w:basedOn w:val="138"/>
-    <w:next w:val="138"/>
+    <w:basedOn w:val="828"/>
+    <w:next w:val="828"/>
     <w:uiPriority w:val="35"/>
     <w:unhideWhenUsed/>
     <w:qFormat/>
@@ -31981,10 +31977,10 @@
       <w:szCs w:val="18"/>
     </w:rPr>
   </w:style>
-  <w:style w:type="paragraph" w:styleId="181">
+  <w:style w:type="paragraph" w:styleId="871">
     <w:name w:val="footnote text"/>
-    <w:basedOn w:val="138"/>
-    <w:link w:val="182"/>
+    <w:basedOn w:val="828"/>
+    <w:link w:val="872"/>
     <w:uiPriority w:val="99"/>
     <w:semiHidden/>
     <w:unhideWhenUsed/>
@@ -31998,10 +31994,10 @@
       <w:szCs w:val="20"/>
     </w:rPr>
   </w:style>
-  <w:style w:type="character" w:styleId="182">
+  <w:style w:type="character" w:styleId="872">
     <w:name w:val="Footnote Text Char"/>
-    <w:basedOn w:val="148"/>
-    <w:link w:val="181"/>
+    <w:basedOn w:val="838"/>
+    <w:link w:val="871"/>
     <w:uiPriority w:val="99"/>
     <w:semiHidden/>
     <w:pPr>
@@ -32014,9 +32010,9 @@
       <w:szCs w:val="20"/>
     </w:rPr>
   </w:style>
-  <w:style w:type="character" w:styleId="183">
+  <w:style w:type="character" w:styleId="873">
     <w:name w:val="footnote reference"/>
-    <w:basedOn w:val="148"/>
+    <w:basedOn w:val="838"/>
     <w:uiPriority w:val="99"/>
     <w:semiHidden/>
     <w:unhideWhenUsed/>
@@ -32029,10 +32025,10 @@
       <w:vertAlign w:val="superscript"/>
     </w:rPr>
   </w:style>
-  <w:style w:type="paragraph" w:styleId="184">
+  <w:style w:type="paragraph" w:styleId="874">
     <w:name w:val="endnote text"/>
-    <w:basedOn w:val="138"/>
-    <w:link w:val="185"/>
+    <w:basedOn w:val="828"/>
+    <w:link w:val="875"/>
     <w:uiPriority w:val="99"/>
     <w:semiHidden/>
     <w:unhideWhenUsed/>
@@ -32046,10 +32042,10 @@
       <w:szCs w:val="20"/>
     </w:rPr>
   </w:style>
-  <w:style w:type="character" w:styleId="185">
+  <w:style w:type="character" w:styleId="875">
     <w:name w:val="Endnote Text Char"/>
-    <w:basedOn w:val="148"/>
-    <w:link w:val="184"/>
+    <w:basedOn w:val="838"/>
+    <w:link w:val="874"/>
     <w:uiPriority w:val="99"/>
     <w:semiHidden/>
     <w:pPr>
@@ -32062,9 +32058,9 @@
       <w:szCs w:val="20"/>
     </w:rPr>
   </w:style>
-  <w:style w:type="character" w:styleId="186">
+  <w:style w:type="character" w:styleId="876">
     <w:name w:val="endnote reference"/>
-    <w:basedOn w:val="148"/>
+    <w:basedOn w:val="838"/>
     <w:uiPriority w:val="99"/>
     <w:semiHidden/>
     <w:unhideWhenUsed/>
@@ -32077,9 +32073,9 @@
       <w:vertAlign w:val="superscript"/>
     </w:rPr>
   </w:style>
-  <w:style w:type="character" w:styleId="187">
+  <w:style w:type="character" w:styleId="877">
     <w:name w:val="Hyperlink"/>
-    <w:basedOn w:val="148"/>
+    <w:basedOn w:val="838"/>
     <w:uiPriority w:val="99"/>
     <w:unhideWhenUsed/>
     <w:pPr>
@@ -32092,9 +32088,9 @@
       <w:u w:val="single"/>
     </w:rPr>
   </w:style>
-  <w:style w:type="character" w:styleId="188">
+  <w:style w:type="character" w:styleId="878">
     <w:name w:val="FollowedHyperlink"/>
-    <w:basedOn w:val="148"/>
+    <w:basedOn w:val="838"/>
     <w:uiPriority w:val="99"/>
     <w:semiHidden/>
     <w:unhideWhenUsed/>
@@ -32108,10 +32104,10 @@
       <w:u w:val="single"/>
     </w:rPr>
   </w:style>
-  <w:style w:type="paragraph" w:styleId="189">
+  <w:style w:type="paragraph" w:styleId="879">
     <w:name w:val="toc 1"/>
-    <w:basedOn w:val="138"/>
-    <w:next w:val="138"/>
+    <w:basedOn w:val="828"/>
+    <w:next w:val="828"/>
     <w:uiPriority w:val="39"/>
     <w:unhideWhenUsed/>
     <w:pPr>
@@ -32120,10 +32116,10 @@
       <w:ind/>
     </w:pPr>
   </w:style>
-  <w:style w:type="paragraph" w:styleId="190">
+  <w:style w:type="paragraph" w:styleId="880">
     <w:name w:val="toc 2"/>
-    <w:basedOn w:val="138"/>
-    <w:next w:val="138"/>
+    <w:basedOn w:val="828"/>
+    <w:next w:val="828"/>
     <w:uiPriority w:val="39"/>
     <w:unhideWhenUsed/>
     <w:pPr>
@@ -32132,10 +32128,10 @@
       <w:ind w:left="220"/>
     </w:pPr>
   </w:style>
-  <w:style w:type="paragraph" w:styleId="191">
+  <w:style w:type="paragraph" w:styleId="881">
     <w:name w:val="toc 3"/>
-    <w:basedOn w:val="138"/>
-    <w:next w:val="138"/>
+    <w:basedOn w:val="828"/>
+    <w:next w:val="828"/>
     <w:uiPriority w:val="39"/>
     <w:unhideWhenUsed/>
     <w:pPr>
@@ -32144,10 +32140,10 @@
       <w:ind w:left="440"/>
     </w:pPr>
   </w:style>
-  <w:style w:type="paragraph" w:styleId="192">
+  <w:style w:type="paragraph" w:styleId="882">
     <w:name w:val="toc 4"/>
-    <w:basedOn w:val="138"/>
-    <w:next w:val="138"/>
+    <w:basedOn w:val="828"/>
+    <w:next w:val="828"/>
     <w:uiPriority w:val="39"/>
     <w:unhideWhenUsed/>
     <w:pPr>
@@ -32156,10 +32152,10 @@
       <w:ind w:left="660"/>
     </w:pPr>
   </w:style>
-  <w:style w:type="paragraph" w:styleId="193">
+  <w:style w:type="paragraph" w:styleId="883">
     <w:name w:val="toc 5"/>
-    <w:basedOn w:val="138"/>
-    <w:next w:val="138"/>
+    <w:basedOn w:val="828"/>
+    <w:next w:val="828"/>
     <w:uiPriority w:val="39"/>
     <w:unhideWhenUsed/>
     <w:pPr>
@@ -32168,10 +32164,10 @@
       <w:ind w:left="880"/>
     </w:pPr>
   </w:style>
-  <w:style w:type="paragraph" w:styleId="194">
+  <w:style w:type="paragraph" w:styleId="884">
     <w:name w:val="toc 6"/>
-    <w:basedOn w:val="138"/>
-    <w:next w:val="138"/>
+    <w:basedOn w:val="828"/>
+    <w:next w:val="828"/>
     <w:uiPriority w:val="39"/>
     <w:unhideWhenUsed/>
     <w:pPr>
@@ -32180,10 +32176,10 @@
       <w:ind w:left="1100"/>
     </w:pPr>
   </w:style>
-  <w:style w:type="paragraph" w:styleId="195">
+  <w:style w:type="paragraph" w:styleId="885">
     <w:name w:val="toc 7"/>
-    <w:basedOn w:val="138"/>
-    <w:next w:val="138"/>
+    <w:basedOn w:val="828"/>
+    <w:next w:val="828"/>
     <w:uiPriority w:val="39"/>
     <w:unhideWhenUsed/>
     <w:pPr>
@@ -32192,10 +32188,10 @@
       <w:ind w:left="1320"/>
     </w:pPr>
   </w:style>
-  <w:style w:type="paragraph" w:styleId="196">
+  <w:style w:type="paragraph" w:styleId="886">
     <w:name w:val="toc 8"/>
-    <w:basedOn w:val="138"/>
-    <w:next w:val="138"/>
+    <w:basedOn w:val="828"/>
+    <w:next w:val="828"/>
     <w:uiPriority w:val="39"/>
     <w:unhideWhenUsed/>
     <w:pPr>
@@ -32204,10 +32200,10 @@
       <w:ind w:left="1540"/>
     </w:pPr>
   </w:style>
-  <w:style w:type="paragraph" w:styleId="197">
+  <w:style w:type="paragraph" w:styleId="887">
     <w:name w:val="toc 9"/>
-    <w:basedOn w:val="138"/>
-    <w:next w:val="138"/>
+    <w:basedOn w:val="828"/>
+    <w:next w:val="828"/>
     <w:uiPriority w:val="39"/>
     <w:unhideWhenUsed/>
     <w:pPr>
@@ -32216,9 +32212,9 @@
       <w:ind w:left="1760"/>
     </w:pPr>
   </w:style>
-  <w:style w:type="character" w:styleId="198">
+  <w:style w:type="character" w:styleId="888">
     <w:name w:val="Placeholder Text"/>
-    <w:basedOn w:val="148"/>
+    <w:basedOn w:val="838"/>
     <w:uiPriority w:val="99"/>
     <w:semiHidden/>
     <w:pPr>
@@ -32230,7 +32226,7 @@
       <w:color w:val="666666"/>
     </w:rPr>
   </w:style>
-  <w:style w:type="paragraph" w:styleId="208">
+  <w:style w:type="paragraph" w:styleId="889">
     <w:name w:val="TOC Heading"/>
     <w:uiPriority w:val="39"/>
     <w:unhideWhenUsed/>
@@ -32240,10 +32236,10 @@
       <w:ind/>
     </w:pPr>
   </w:style>
-  <w:style w:type="paragraph" w:styleId="209">
+  <w:style w:type="paragraph" w:styleId="890">
     <w:name w:val="table of figures"/>
-    <w:basedOn w:val="138"/>
-    <w:next w:val="138"/>
+    <w:basedOn w:val="828"/>
+    <w:next w:val="828"/>
     <w:uiPriority w:val="99"/>
     <w:unhideWhenUsed/>
     <w:pPr>

</xml_diff>